<commit_message>
docs(informe): enriquecer explicaciones tecnicas y pedagogicas segun pautas del skill
</commit_message>
<xml_diff>
--- a/entregables/Desarrollo_de_IA_ev_N2.docx
+++ b/entregables/Desarrollo_de_IA_ev_N2.docx
@@ -4,108 +4,154 @@
   <w:body>
     <w:p>
       <w:pPr>
-        <w:jc w:val="center"/>
+        <w:spacing w:before="0" w:after="40"/>
+        <w:jc w:val="both"/>
       </w:pPr>
       <w:r>
         <w:rPr>
-          <w:b/>
-          <w:color w:val="1F4E79"/>
-          <w:sz w:val="32"/>
+          <w:rFonts w:ascii="Calibri" w:hAnsi="Calibri"/>
+          <w:color w:val="00A8E3"/>
+          <w:sz w:val="30"/>
         </w:rPr>
         <w:t>TECNICATURA SUPERIOR EN</w:t>
-        <w:br/>
-        <w:t>DESARROLLO DE SOFTWARE</w:t>
-        <w:br/>
       </w:r>
     </w:p>
     <w:p>
       <w:pPr>
-        <w:jc w:val="center"/>
+        <w:spacing w:before="0" w:after="400"/>
+        <w:jc w:val="both"/>
       </w:pPr>
       <w:r>
         <w:rPr>
-          <w:i/>
-          <w:sz w:val="26"/>
+          <w:rFonts w:ascii="Calibri" w:hAnsi="Calibri"/>
+          <w:b/>
+          <w:color w:val="00A8E3"/>
+          <w:sz w:val="30"/>
         </w:rPr>
-        <w:t>Espacio curricular: Desarrollo de Inteligencia Artificial</w:t>
-        <w:br/>
+        <w:t>Desarrollo de Software</w:t>
       </w:r>
     </w:p>
     <w:p>
       <w:pPr>
-        <w:jc w:val="center"/>
+        <w:spacing w:before="480" w:after="80"/>
       </w:pPr>
       <w:r>
         <w:rPr>
-          <w:sz w:val="24"/>
+          <w:rFonts w:ascii="Calibri" w:hAnsi="Calibri"/>
+          <w:color w:val="00A8E3"/>
+          <w:sz w:val="38"/>
         </w:rPr>
-        <w:t>Profesora: Cra. Sol Figueroa</w:t>
-        <w:br/>
-      </w:r>
-    </w:p>
-    <w:p/>
-    <w:p>
-      <w:pPr>
-        <w:jc w:val="center"/>
-      </w:pPr>
-      <w:r>
-        <w:rPr>
-          <w:b/>
-          <w:color w:val="003366"/>
-          <w:sz w:val="36"/>
-        </w:rPr>
-        <w:t>Evidencia de Aprendizaje N.º 2</w:t>
-        <w:br/>
-        <w:t>Modelado y Evaluación de Desempeño</w:t>
-        <w:br/>
-      </w:r>
-      <w:r>
-        <w:rPr>
-          <w:color w:val="555555"/>
-          <w:sz w:val="24"/>
-        </w:rPr>
-        <w:t>Predicción del Costo Unitario de Neumáticos mediante Regresión Lineal</w:t>
-        <w:br/>
-      </w:r>
-    </w:p>
-    <w:p/>
-    <w:p>
-      <w:pPr>
-        <w:jc w:val="center"/>
-      </w:pPr>
-      <w:r>
-        <w:rPr>
-          <w:b/>
-          <w:color w:val="1F4E79"/>
-          <w:sz w:val="24"/>
-        </w:rPr>
-        <w:t>INTEGRANTES:</w:t>
-        <w:br/>
-      </w:r>
-      <w:r>
-        <w:rPr>
-          <w:sz w:val="24"/>
-        </w:rPr>
-        <w:t>Vargas, Cristian</w:t>
-        <w:br/>
-        <w:t>Quinteros, Karina</w:t>
-        <w:br/>
-        <w:t>Zárate, Laura</w:t>
-        <w:br/>
+        <w:t>Espacio curricular</w:t>
       </w:r>
     </w:p>
     <w:p>
       <w:pPr>
-        <w:jc w:val="center"/>
+        <w:spacing w:before="0" w:after="480"/>
       </w:pPr>
       <w:r>
         <w:rPr>
-          <w:i/>
-          <w:sz w:val="20"/>
+          <w:rFonts w:ascii="Calibri" w:hAnsi="Calibri"/>
+          <w:b/>
+          <w:color w:val="00A8E3"/>
+          <w:sz w:val="48"/>
         </w:rPr>
-        <w:t>Septiembre de 2026</w:t>
-        <w:br/>
-        <w:t>ISPC — Córdoba, Argentina</w:t>
+        <w:t>Desarrollo de Inteligencia Artificial</w:t>
+      </w:r>
+    </w:p>
+    <w:p>
+      <w:pPr>
+        <w:spacing w:before="240" w:after="40"/>
+      </w:pPr>
+      <w:r>
+        <w:rPr>
+          <w:rFonts w:ascii="Calibri" w:hAnsi="Calibri"/>
+          <w:color w:val="00A8E3"/>
+          <w:sz w:val="38"/>
+        </w:rPr>
+        <w:t>Docente</w:t>
+      </w:r>
+    </w:p>
+    <w:p>
+      <w:pPr>
+        <w:spacing w:before="0" w:after="480"/>
+      </w:pPr>
+      <w:r>
+        <w:rPr>
+          <w:rFonts w:ascii="Calibri" w:hAnsi="Calibri"/>
+          <w:b/>
+          <w:color w:val="00A8E3"/>
+          <w:sz w:val="38"/>
+        </w:rPr>
+        <w:t>Cra. Sol Figueroa</w:t>
+      </w:r>
+    </w:p>
+    <w:p>
+      <w:pPr>
+        <w:spacing w:before="240" w:after="80"/>
+      </w:pPr>
+      <w:r>
+        <w:rPr>
+          <w:rFonts w:ascii="Calibri" w:hAnsi="Calibri"/>
+          <w:color w:val="00A8E3"/>
+          <w:sz w:val="38"/>
+        </w:rPr>
+        <w:t>Estudiantes</w:t>
+      </w:r>
+    </w:p>
+    <w:p>
+      <w:pPr>
+        <w:spacing w:before="0" w:after="40"/>
+      </w:pPr>
+      <w:r>
+        <w:rPr>
+          <w:rFonts w:ascii="Calibri" w:hAnsi="Calibri"/>
+          <w:b/>
+          <w:color w:val="00A8E3"/>
+          <w:sz w:val="30"/>
+        </w:rPr>
+        <w:t>Vargas, Cristian</w:t>
+      </w:r>
+    </w:p>
+    <w:p>
+      <w:pPr>
+        <w:spacing w:before="0" w:after="40"/>
+      </w:pPr>
+      <w:r>
+        <w:rPr>
+          <w:rFonts w:ascii="Calibri" w:hAnsi="Calibri"/>
+          <w:b/>
+          <w:color w:val="00A8E3"/>
+          <w:sz w:val="30"/>
+        </w:rPr>
+        <w:t>Quinteros, Karina</w:t>
+      </w:r>
+    </w:p>
+    <w:p>
+      <w:pPr>
+        <w:spacing w:before="0" w:after="40"/>
+      </w:pPr>
+      <w:r>
+        <w:rPr>
+          <w:rFonts w:ascii="Calibri" w:hAnsi="Calibri"/>
+          <w:b/>
+          <w:color w:val="00A8E3"/>
+          <w:sz w:val="30"/>
+        </w:rPr>
+        <w:t>Zárate, Laura</w:t>
+      </w:r>
+    </w:p>
+    <w:p>
+      <w:pPr>
+        <w:spacing w:before="800" w:after="0"/>
+      </w:pPr>
+      <w:r>
+        <w:rPr>
+          <w:rFonts w:ascii="Calibri" w:hAnsi="Calibri"/>
+          <w:b/>
+          <w:color w:val="00A8E3"/>
+          <w:sz w:val="38"/>
+        </w:rPr>
+        <w:t>Año 2026</w:t>
       </w:r>
     </w:p>
     <w:p>
@@ -115,221 +161,487 @@
     </w:p>
     <w:p>
       <w:pPr>
-        <w:spacing w:before="320" w:after="120"/>
+        <w:spacing w:before="240" w:after="80"/>
       </w:pPr>
       <w:r>
         <w:rPr>
+          <w:rFonts w:ascii="Calibri" w:hAnsi="Calibri"/>
           <w:b/>
-          <w:color w:val="1F4E79"/>
-          <w:sz w:val="28"/>
+          <w:color w:val="1E3A8A"/>
+          <w:sz w:val="44"/>
         </w:rPr>
-        <w:t>1. Resumen Ejecutivo</w:t>
+        <w:t>EVIDENCIA DE APRENDIZAJE N.º 2</w:t>
       </w:r>
     </w:p>
     <w:p>
       <w:pPr>
-        <w:spacing w:after="120" w:line="276" w:lineRule="auto"/>
+        <w:spacing w:before="0" w:after="320"/>
       </w:pPr>
       <w:r>
         <w:rPr>
-          <w:sz w:val="22"/>
+          <w:rFonts w:ascii="Calibri" w:hAnsi="Calibri"/>
+          <w:color w:val="2563EB"/>
+          <w:sz w:val="28"/>
         </w:rPr>
-        <w:t>En el marco de la Evidencia de Aprendizaje N.º 2, se desarrolló e implementó un sistema de aprendizaje automático supervisado basado en el paradigma de Regresión Lineal, orientado a estimar con rigor estadístico el costo unitario de catálogo (Unit Cost en INR) de neumáticos a partir de sus especificaciones físicas intrínsecas y su marca fabricante.</w:t>
-        <w:br/>
-        <w:br/>
-        <w:t>El desarrollo continúa directamente las conclusiones del Análisis Exploratorio de Datos (EDA) entregado en la Evidencia N.º 1. Se aplicó una división estricta en 80% entrenamiento (200 registros) y 20% prueba (51 registros) con semilla reproducible (random_state=42). Se comparó un modelo baseline de Regresión Lineal Simple frente a un modelo de Regresión Lineal Múltiple. El modelo múltiple demostró un salto sustancial de capacidad predictiva: el error absoluto medio (MAE) descendió de 2.795,00 INR a 1.678,60 INR, y el coeficiente de determinación (R²) se incrementó de 0,5421 a 0,7968 (casi el 80% de varianza explicada en datos de prueba no vistos).</w:t>
+        <w:t>Modelado Predictivo de Costo Unitario mediante Regresión Lineal Simple y Múltiple</w:t>
       </w:r>
     </w:p>
     <w:p>
       <w:pPr>
-        <w:spacing w:before="320" w:after="120"/>
+        <w:spacing w:before="360" w:after="20"/>
       </w:pPr>
       <w:r>
         <w:rPr>
+          <w:rFonts w:ascii="Calibri" w:hAnsi="Calibri"/>
           <w:b/>
-          <w:color w:val="1F4E79"/>
-          <w:sz w:val="28"/>
+          <w:color w:val="2563EB"/>
+          <w:sz w:val="22"/>
         </w:rPr>
-        <w:t>2. Antecedentes y Enlace con la Evidencia N.º 1</w:t>
+        <w:t>FASE 1</w:t>
       </w:r>
     </w:p>
     <w:p>
       <w:pPr>
-        <w:spacing w:after="120" w:line="276" w:lineRule="auto"/>
+        <w:spacing w:before="0" w:after="160"/>
       </w:pPr>
       <w:r>
         <w:rPr>
-          <w:sz w:val="22"/>
+          <w:rFonts w:ascii="Calibri" w:hAnsi="Calibri"/>
+          <w:b/>
+          <w:color w:val="1E3A8A"/>
+          <w:sz w:val="30"/>
         </w:rPr>
-        <w:t>En la Evidencia 1, el equipo analizó las fuentes de datos del proyecto (Current Stock, Sales y Supplier). Dicho informe concluyó:</w:t>
-        <w:br/>
-        <w:t>• Las dimensiones técnicas del neumático están codificadas en el nombre del producto (Product Name).</w:t>
-        <w:br/>
-        <w:t>• El diámetro del rin (Rim) presentó la correlación lineal individual más alta con el costo (r = 0,76), seguido por el ancho de sección (Width, r = 0,44).</w:t>
-        <w:br/>
-        <w:t>• La relación de aspecto (Aspect Ratio) exhibió una correlación moderada-baja (r = 0,36), mientras que el stock actual no aportó señal física (r = 0,08).</w:t>
-        <w:br/>
-        <w:t>• La variable Brand presenta niveles diferenciados de precio según el segmento de mercado del fabricante.</w:t>
-        <w:br/>
-        <w:t>• El informe anterior concluyó expresamente que dicha estructura configuraba una 'buena señal para regresión'.</w:t>
+        <w:t>Conexión con el EDA y Formulación del Problema</w:t>
       </w:r>
     </w:p>
     <w:p>
       <w:pPr>
-        <w:spacing w:before="320" w:after="120"/>
+        <w:spacing w:before="0" w:after="120" w:line="276" w:lineRule="auto"/>
       </w:pPr>
       <w:r>
         <w:rPr>
-          <w:b/>
-          <w:color w:val="1F4E79"/>
-          <w:sz w:val="28"/>
+          <w:rFonts w:ascii="Calibri" w:hAnsi="Calibri"/>
+          <w:color w:val="1A1A2E"/>
+          <w:sz w:val="21"/>
         </w:rPr>
-        <w:t>3. Formulación del Problema y Justificación del Dataset</w:t>
+        <w:t>En la Evidencia N.º 1, el equipo concluyó que el catálogo de neumáticos presenta una estructura dimensional directamente correlacionada con su estructura de valor. El diámetro del rin (Rim) exhibió la correlación lineal individual más alta (r = 0,76) con el costo unitario, seguido del ancho de sección (Width, r = 0,44). Por su parte, la marca (Brand) evidenció diferencias notorias de precio según el segmento del fabricante. Para esta Evidencia N.º 2, se formula formalmente el problema de Aprendizaje Supervisado bajo el paradigma de Regresión Lineal:</w:t>
       </w:r>
     </w:p>
+    <w:tbl>
+      <w:tblPr>
+        <w:tblW w:type="auto" w:w="0"/>
+        <w:jc w:val="center"/>
+        <w:tblLook w:firstColumn="1" w:firstRow="1" w:lastColumn="0" w:lastRow="0" w:noHBand="0" w:noVBand="1" w:val="04A0"/>
+        <w:tblBorders>
+          <w:top w:val="single" w:sz="4" w:space="0" w:color="cbd5e1"/>
+          <w:bottom w:val="single" w:sz="6" w:space="0" w:color="cbd5e1"/>
+          <w:left w:val="none"/>
+          <w:right w:val="none"/>
+          <w:insideH w:val="single" w:sz="4" w:space="0" w:color="cbd5e1"/>
+          <w:insideV w:val="none"/>
+        </w:tblBorders>
+      </w:tblPr>
+      <w:tblGrid>
+        <w:gridCol w:w="2340"/>
+        <w:gridCol w:w="2340"/>
+        <w:gridCol w:w="2340"/>
+        <w:gridCol w:w="2340"/>
+      </w:tblGrid>
+      <w:tr>
+        <w:tc>
+          <w:tcPr>
+            <w:tcW w:type="dxa" w:w="2340"/>
+            <w:shd w:fill="eef2fb"/>
+            <w:tcMar>
+              <w:top w:w="120" w:type="dxa"/>
+              <w:bottom w:w="120" w:type="dxa"/>
+              <w:left w:w="140" w:type="dxa"/>
+              <w:right w:w="140" w:type="dxa"/>
+            </w:tcMar>
+          </w:tcPr>
+          <w:p>
+            <w:pPr>
+              <w:spacing w:after="0"/>
+            </w:pPr>
+            <w:r>
+              <w:rPr>
+                <w:rFonts w:ascii="Calibri" w:hAnsi="Calibri"/>
+                <w:b/>
+                <w:color w:val="1E3A8A"/>
+                <w:sz w:val="20"/>
+              </w:rPr>
+              <w:t>Dataset Seleccionado</w:t>
+            </w:r>
+          </w:p>
+        </w:tc>
+        <w:tc>
+          <w:tcPr>
+            <w:tcW w:type="dxa" w:w="2340"/>
+            <w:shd w:fill="eef2fb"/>
+            <w:tcMar>
+              <w:top w:w="120" w:type="dxa"/>
+              <w:bottom w:w="120" w:type="dxa"/>
+              <w:left w:w="140" w:type="dxa"/>
+              <w:right w:w="140" w:type="dxa"/>
+            </w:tcMar>
+          </w:tcPr>
+          <w:p>
+            <w:pPr>
+              <w:spacing w:after="0"/>
+            </w:pPr>
+            <w:r>
+              <w:rPr>
+                <w:rFonts w:ascii="Calibri" w:hAnsi="Calibri"/>
+                <w:b/>
+                <w:color w:val="1E3A8A"/>
+                <w:sz w:val="20"/>
+              </w:rPr>
+              <w:t>Variable Target</w:t>
+            </w:r>
+          </w:p>
+        </w:tc>
+        <w:tc>
+          <w:tcPr>
+            <w:tcW w:type="dxa" w:w="2340"/>
+            <w:shd w:fill="eef2fb"/>
+            <w:tcMar>
+              <w:top w:w="120" w:type="dxa"/>
+              <w:bottom w:w="120" w:type="dxa"/>
+              <w:left w:w="140" w:type="dxa"/>
+              <w:right w:w="140" w:type="dxa"/>
+            </w:tcMar>
+          </w:tcPr>
+          <w:p>
+            <w:pPr>
+              <w:spacing w:after="0"/>
+            </w:pPr>
+            <w:r>
+              <w:rPr>
+                <w:rFonts w:ascii="Calibri" w:hAnsi="Calibri"/>
+                <w:b/>
+                <w:color w:val="1E3A8A"/>
+                <w:sz w:val="20"/>
+              </w:rPr>
+              <w:t>Variables Predictoras</w:t>
+            </w:r>
+          </w:p>
+        </w:tc>
+        <w:tc>
+          <w:tcPr>
+            <w:tcW w:type="dxa" w:w="2340"/>
+            <w:shd w:fill="eef2fb"/>
+            <w:tcMar>
+              <w:top w:w="120" w:type="dxa"/>
+              <w:bottom w:w="120" w:type="dxa"/>
+              <w:left w:w="140" w:type="dxa"/>
+              <w:right w:w="140" w:type="dxa"/>
+            </w:tcMar>
+          </w:tcPr>
+          <w:p>
+            <w:pPr>
+              <w:spacing w:after="0"/>
+            </w:pPr>
+            <w:r>
+              <w:rPr>
+                <w:rFonts w:ascii="Calibri" w:hAnsi="Calibri"/>
+                <w:b/>
+                <w:color w:val="1E3A8A"/>
+                <w:sz w:val="20"/>
+              </w:rPr>
+              <w:t>Propósito del Modelo</w:t>
+            </w:r>
+          </w:p>
+        </w:tc>
+      </w:tr>
+      <w:tr>
+        <w:tc>
+          <w:tcPr>
+            <w:tcW w:type="dxa" w:w="2340"/>
+            <w:tcMar>
+              <w:top w:w="120" w:type="dxa"/>
+              <w:bottom w:w="120" w:type="dxa"/>
+              <w:left w:w="140" w:type="dxa"/>
+              <w:right w:w="140" w:type="dxa"/>
+            </w:tcMar>
+          </w:tcPr>
+          <w:p>
+            <w:pPr>
+              <w:spacing w:after="0"/>
+            </w:pPr>
+            <w:r>
+              <w:rPr>
+                <w:rFonts w:ascii="Calibri" w:hAnsi="Calibri"/>
+                <w:sz w:val="19"/>
+              </w:rPr>
+              <w:t>DS_Data_Set_Current_Stock.csv</w:t>
+            </w:r>
+          </w:p>
+        </w:tc>
+        <w:tc>
+          <w:tcPr>
+            <w:tcW w:type="dxa" w:w="2340"/>
+            <w:tcMar>
+              <w:top w:w="120" w:type="dxa"/>
+              <w:bottom w:w="120" w:type="dxa"/>
+              <w:left w:w="140" w:type="dxa"/>
+              <w:right w:w="140" w:type="dxa"/>
+            </w:tcMar>
+          </w:tcPr>
+          <w:p>
+            <w:pPr>
+              <w:spacing w:after="0"/>
+            </w:pPr>
+            <w:r>
+              <w:rPr>
+                <w:rFonts w:ascii="Calibri" w:hAnsi="Calibri"/>
+                <w:sz w:val="19"/>
+              </w:rPr>
+              <w:t>Unit Cost (INR)</w:t>
+              <w:br/>
+              <w:t>(Continuo, Escala de Razón)</w:t>
+            </w:r>
+          </w:p>
+        </w:tc>
+        <w:tc>
+          <w:tcPr>
+            <w:tcW w:type="dxa" w:w="2340"/>
+            <w:tcMar>
+              <w:top w:w="120" w:type="dxa"/>
+              <w:bottom w:w="120" w:type="dxa"/>
+              <w:left w:w="140" w:type="dxa"/>
+              <w:right w:w="140" w:type="dxa"/>
+            </w:tcMar>
+          </w:tcPr>
+          <w:p>
+            <w:pPr>
+              <w:spacing w:after="0"/>
+            </w:pPr>
+            <w:r>
+              <w:rPr>
+                <w:rFonts w:ascii="Calibri" w:hAnsi="Calibri"/>
+                <w:sz w:val="19"/>
+              </w:rPr>
+              <w:t>Rim, Width, Aspect Ratio y Brand</w:t>
+            </w:r>
+          </w:p>
+        </w:tc>
+        <w:tc>
+          <w:tcPr>
+            <w:tcW w:type="dxa" w:w="2340"/>
+            <w:tcMar>
+              <w:top w:w="120" w:type="dxa"/>
+              <w:bottom w:w="120" w:type="dxa"/>
+              <w:left w:w="140" w:type="dxa"/>
+              <w:right w:w="140" w:type="dxa"/>
+            </w:tcMar>
+          </w:tcPr>
+          <w:p>
+            <w:pPr>
+              <w:spacing w:after="0"/>
+            </w:pPr>
+            <w:r>
+              <w:rPr>
+                <w:rFonts w:ascii="Calibri" w:hAnsi="Calibri"/>
+                <w:sz w:val="19"/>
+              </w:rPr>
+              <w:t>Predecir el costo unitario del neumático a partir de sus cotas físicas y fabricante</w:t>
+            </w:r>
+          </w:p>
+        </w:tc>
+      </w:tr>
+      <w:tr>
+        <w:tc>
+          <w:tcPr>
+            <w:tcW w:type="dxa" w:w="2340"/>
+            <w:tcMar>
+              <w:top w:w="120" w:type="dxa"/>
+              <w:bottom w:w="120" w:type="dxa"/>
+              <w:left w:w="140" w:type="dxa"/>
+              <w:right w:w="140" w:type="dxa"/>
+            </w:tcMar>
+          </w:tcPr>
+          <w:p>
+            <w:pPr>
+              <w:spacing w:after="0"/>
+            </w:pPr>
+            <w:r>
+              <w:rPr>
+                <w:rFonts w:ascii="Calibri" w:hAnsi="Calibri"/>
+                <w:sz w:val="19"/>
+              </w:rPr>
+              <w:t>Justificación de Grano</w:t>
+            </w:r>
+          </w:p>
+        </w:tc>
+        <w:tc>
+          <w:tcPr>
+            <w:tcW w:type="dxa" w:w="2340"/>
+            <w:tcMar>
+              <w:top w:w="120" w:type="dxa"/>
+              <w:bottom w:w="120" w:type="dxa"/>
+              <w:left w:w="140" w:type="dxa"/>
+              <w:right w:w="140" w:type="dxa"/>
+            </w:tcMar>
+          </w:tcPr>
+          <w:p>
+            <w:pPr>
+              <w:spacing w:after="0"/>
+            </w:pPr>
+            <w:r>
+              <w:rPr>
+                <w:rFonts w:ascii="Calibri" w:hAnsi="Calibri"/>
+                <w:sz w:val="19"/>
+              </w:rPr>
+              <w:t>1 producto físico (SKU)</w:t>
+            </w:r>
+          </w:p>
+        </w:tc>
+        <w:tc>
+          <w:tcPr>
+            <w:tcW w:type="dxa" w:w="2340"/>
+            <w:tcMar>
+              <w:top w:w="120" w:type="dxa"/>
+              <w:bottom w:w="120" w:type="dxa"/>
+              <w:left w:w="140" w:type="dxa"/>
+              <w:right w:w="140" w:type="dxa"/>
+            </w:tcMar>
+          </w:tcPr>
+          <w:p>
+            <w:pPr>
+              <w:spacing w:after="0"/>
+            </w:pPr>
+            <w:r>
+              <w:rPr>
+                <w:rFonts w:ascii="Calibri" w:hAnsi="Calibri"/>
+                <w:sz w:val="19"/>
+              </w:rPr>
+              <w:t>Foto estática de inventario</w:t>
+            </w:r>
+          </w:p>
+        </w:tc>
+        <w:tc>
+          <w:tcPr>
+            <w:tcW w:type="dxa" w:w="2340"/>
+            <w:tcMar>
+              <w:top w:w="120" w:type="dxa"/>
+              <w:bottom w:w="120" w:type="dxa"/>
+              <w:left w:w="140" w:type="dxa"/>
+              <w:right w:w="140" w:type="dxa"/>
+            </w:tcMar>
+          </w:tcPr>
+          <w:p>
+            <w:pPr>
+              <w:spacing w:after="0"/>
+            </w:pPr>
+            <w:r>
+              <w:rPr>
+                <w:rFonts w:ascii="Calibri" w:hAnsi="Calibri"/>
+                <w:sz w:val="19"/>
+              </w:rPr>
+              <w:t>Evita distorsionar el costo de fabricación con volumen transaccional de Sales</w:t>
+            </w:r>
+          </w:p>
+        </w:tc>
+      </w:tr>
+      <w:tr>
+        <w:tc>
+          <w:tcPr>
+            <w:tcW w:type="dxa" w:w="2340"/>
+            <w:tcMar>
+              <w:top w:w="120" w:type="dxa"/>
+              <w:bottom w:w="120" w:type="dxa"/>
+              <w:left w:w="140" w:type="dxa"/>
+              <w:right w:w="140" w:type="dxa"/>
+            </w:tcMar>
+          </w:tcPr>
+          <w:p>
+            <w:pPr>
+              <w:spacing w:after="0"/>
+            </w:pPr>
+            <w:r>
+              <w:rPr>
+                <w:rFonts w:ascii="Calibri" w:hAnsi="Calibri"/>
+                <w:sz w:val="19"/>
+              </w:rPr>
+              <w:t>Muestra Supervisada</w:t>
+            </w:r>
+          </w:p>
+        </w:tc>
+        <w:tc>
+          <w:tcPr>
+            <w:tcW w:type="dxa" w:w="2340"/>
+            <w:tcMar>
+              <w:top w:w="120" w:type="dxa"/>
+              <w:bottom w:w="120" w:type="dxa"/>
+              <w:left w:w="140" w:type="dxa"/>
+              <w:right w:w="140" w:type="dxa"/>
+            </w:tcMar>
+          </w:tcPr>
+          <w:p>
+            <w:pPr>
+              <w:spacing w:after="0"/>
+            </w:pPr>
+            <w:r>
+              <w:rPr>
+                <w:rFonts w:ascii="Calibri" w:hAnsi="Calibri"/>
+                <w:sz w:val="19"/>
+              </w:rPr>
+              <w:t>251 productos limpios</w:t>
+            </w:r>
+          </w:p>
+        </w:tc>
+        <w:tc>
+          <w:tcPr>
+            <w:tcW w:type="dxa" w:w="2340"/>
+            <w:tcMar>
+              <w:top w:w="120" w:type="dxa"/>
+              <w:bottom w:w="120" w:type="dxa"/>
+              <w:left w:w="140" w:type="dxa"/>
+              <w:right w:w="140" w:type="dxa"/>
+            </w:tcMar>
+          </w:tcPr>
+          <w:p>
+            <w:pPr>
+              <w:spacing w:after="0"/>
+            </w:pPr>
+            <w:r>
+              <w:rPr>
+                <w:rFonts w:ascii="Calibri" w:hAnsi="Calibri"/>
+                <w:sz w:val="19"/>
+              </w:rPr>
+              <w:t>2 nulos descartados</w:t>
+            </w:r>
+          </w:p>
+        </w:tc>
+        <w:tc>
+          <w:tcPr>
+            <w:tcW w:type="dxa" w:w="2340"/>
+            <w:tcMar>
+              <w:top w:w="120" w:type="dxa"/>
+              <w:bottom w:w="120" w:type="dxa"/>
+              <w:left w:w="140" w:type="dxa"/>
+              <w:right w:w="140" w:type="dxa"/>
+            </w:tcMar>
+          </w:tcPr>
+          <w:p>
+            <w:pPr>
+              <w:spacing w:after="0"/>
+            </w:pPr>
+            <w:r>
+              <w:rPr>
+                <w:rFonts w:ascii="Calibri" w:hAnsi="Calibri"/>
+                <w:sz w:val="19"/>
+              </w:rPr>
+              <w:t>Sin data leakage (Train 80% [200] / Test 20% [51])</w:t>
+            </w:r>
+          </w:p>
+        </w:tc>
+      </w:tr>
+    </w:tbl>
     <w:p>
       <w:pPr>
-        <w:spacing w:after="120" w:line="276" w:lineRule="auto"/>
+        <w:spacing w:after="120"/>
       </w:pPr>
-      <w:r>
-        <w:rPr>
-          <w:sz w:val="22"/>
-        </w:rPr>
-        <w:t>• Variable Objetivo (Target): Unit Cost (INR), de naturaleza cuantitativa continua, correspondiente al costo unitario del producto del catálogo.</w:t>
-        <w:br/>
-        <w:t>• Dataset Seleccionado: DS_Data_Set_Current_Stock.csv (253 registros iniciales).</w:t>
-        <w:br/>
-        <w:t>• Justificación de Exclusión de Tablas Transaccionales: Al modelar el costo intrínseco del neumático como bien físico, la unidad de estudio debe ser el producto de catálogo. Incorporar la tabla Sales distorsionaría el análisis porque ponderaría los productos por el volumen de venta de cada cliente y mezclaría precios con niveles de descuento (Price Level) y devoluciones.</w:t>
-      </w:r>
-    </w:p>
-    <w:p>
-      <w:pPr>
-        <w:spacing w:before="320" w:after="120"/>
-      </w:pPr>
-      <w:r>
-        <w:rPr>
-          <w:b/>
-          <w:color w:val="1F4E79"/>
-          <w:sz w:val="28"/>
-        </w:rPr>
-        <w:t>4. Metodología de Preprocesamiento e Ingeniería de Features</w:t>
-      </w:r>
-    </w:p>
-    <w:p>
-      <w:pPr>
-        <w:spacing w:after="120" w:line="276" w:lineRule="auto"/>
-      </w:pPr>
-      <w:r>
-        <w:rPr>
-          <w:sz w:val="22"/>
-        </w:rPr>
-        <w:t>4.1 Depuración del Target: Se removieron comas y comillas de la columna Unit Cost (INR). Se eliminaron estrictamente las 2 observaciones con costo nulo (productos P0166 y P0119), dejando una población supervisada limpia de 251 observaciones. No se imputó el target.</w:t>
-        <w:br/>
-        <w:br/>
-        <w:t>4.2 Parser Taxonómico en Tres Niveles: Se implementó un extractor regex que cubre el 100% de los productos:</w:t>
-        <w:br/>
-        <w:t xml:space="preserve">  - Nivel 1 (Métrico explícito): Extrae Width en mm, Rim en pulgadas y Aspect Ratio tras la barra divisoria (218 productos).</w:t>
-        <w:br/>
-        <w:t xml:space="preserve">  - Nivel 2 (Flotación en pulgadas, ej. 31 x 10.50 R 15): Convierte Width a mm (10.50 x 25.4 = 266.7 mm) y calcula geométricamente el perfil real según la altura de flanco H = (31 - 15) / 2 = 8 in, resultando en Aspect Ratio = (8 / 10.5) x 100 = 76,19% (11 productos).</w:t>
-        <w:br/>
-        <w:t xml:space="preserve">  - Nivel 3 (Sin ratio deducible): Comerciales ligeros tipo C (18 productos) y camión pesado (6 productos). El parser extrae Width y Rim, asignando estrictamente NaN en Aspect Ratio para evitar invenciones arbitrarias.</w:t>
-        <w:br/>
-        <w:br/>
-        <w:t>4.3 Imputación sin Fuga de Datos: Primero se dividió el dataset en Train y Test. Luego se calculó la mediana de Aspect Ratio exclusivamente sobre Train (65,00%) y se imputó dicho valor escalar tanto en Train como en Test.</w:t>
-        <w:br/>
-        <w:br/>
-        <w:t>4.4 One-Hot Encoding de Marca: Se codificó la variable Brand con pd.get_dummies fijando explícitamente a BRAND_A como categoría de referencia (omitida), alineando Test con reindex.</w:t>
-      </w:r>
-    </w:p>
-    <w:p>
-      <w:pPr>
-        <w:spacing w:before="320" w:after="120"/>
-      </w:pPr>
-      <w:r>
-        <w:rPr>
-          <w:b/>
-          <w:color w:val="1F4E79"/>
-          <w:sz w:val="28"/>
-        </w:rPr>
-        <w:t>5. Partición del Dataset (Train / Test Split)</w:t>
-      </w:r>
-    </w:p>
-    <w:p>
-      <w:pPr>
-        <w:spacing w:after="120" w:line="276" w:lineRule="auto"/>
-      </w:pPr>
-      <w:r>
-        <w:rPr>
-          <w:sz w:val="22"/>
-        </w:rPr>
-        <w:t>Se aplicó train_test_split(test_size=0.20, random_state=42). Con 251 observaciones discretas, la partición efectiva produjo exactamente:</w:t>
-        <w:br/>
-        <w:t>• Conjunto de Entrenamiento (Train): 200 observaciones (79,68%)</w:t>
-        <w:br/>
-        <w:t>• Conjunto de Prueba (Test): 51 observaciones (20,32%)</w:t>
-        <w:br/>
-        <w:br/>
-        <w:t>La semilla random_state=42 asegura la perfecta reproducibilidad de todos los cálculos. Se mantuvo el enfoque sin estandarización afín (sin StandardScaler) para preservar la lectura directa de los coeficientes en INR, siguiendo la pauta pedagógica del Colab de la cátedra.</w:t>
-      </w:r>
-    </w:p>
-    <w:p>
-      <w:pPr>
-        <w:spacing w:before="320" w:after="120"/>
-      </w:pPr>
-      <w:r>
-        <w:rPr>
-          <w:b/>
-          <w:color w:val="1F4E79"/>
-          <w:sz w:val="28"/>
-        </w:rPr>
-        <w:t>6. Modelos Entrenados y Parámetros Obtenidos</w:t>
-      </w:r>
-    </w:p>
-    <w:p>
-      <w:pPr>
-        <w:spacing w:after="120" w:line="276" w:lineRule="auto"/>
-      </w:pPr>
-      <w:r>
-        <w:rPr>
-          <w:sz w:val="22"/>
-        </w:rPr>
-        <w:t>6.1 Modelo Simple (Baseline):</w:t>
-        <w:br/>
-        <w:t>Ecuación: Costo = -22.783,89 + 1.957,17 · Rim</w:t>
-        <w:br/>
-        <w:t>Interpretación: Por cada pulgada adicional de rin, el costo promedio estimado sube en casi 2.000 INR.</w:t>
-        <w:br/>
-        <w:br/>
-        <w:t>6.2 Modelo Múltiple (Integrador):</w:t>
-        <w:br/>
-        <w:t>Ecuación: Costo = -34.926,44 + 1.498,42 · Rim + 24,09 · Width + 223,70 · Ratio + 468,73 · B_B - 1.070,51 · B_C + 4.821,93 · B_D</w:t>
-        <w:br/>
-        <w:t>Interpretación: Manteniendo constantes las dimensiones físicas, BRAND_C cuesta en promedio 1.070,51 INR menos que BRAND_A (marca económica), mientras que BRAND_D exhibe una prima positiva de 4.821,93 INR (gama industrial/pesada).</w:t>
-      </w:r>
-    </w:p>
-    <w:p>
-      <w:pPr>
-        <w:spacing w:before="320" w:after="120"/>
-      </w:pPr>
-      <w:r>
-        <w:rPr>
-          <w:b/>
-          <w:color w:val="1F4E79"/>
-          <w:sz w:val="28"/>
-        </w:rPr>
-        <w:t>7. Evaluación de Desempeño sobre Datos de Prueba</w:t>
-      </w:r>
-    </w:p>
-    <w:p>
-      <w:pPr>
-        <w:spacing w:after="120" w:line="276" w:lineRule="auto"/>
-      </w:pPr>
-      <w:r>
-        <w:rPr>
-          <w:sz w:val="22"/>
-        </w:rPr>
-        <w:t>A continuación se detallan las métricas oficiales evaluadas sobre las 51 observaciones de prueba (Test):</w:t>
-      </w:r>
     </w:p>
     <w:tbl>
       <w:tblPr>
@@ -338,45 +650,981 @@
         <w:tblLook w:firstColumn="1" w:firstRow="1" w:lastColumn="0" w:lastRow="0" w:noHBand="0" w:noVBand="1" w:val="04A0"/>
       </w:tblPr>
       <w:tblGrid>
-        <w:gridCol w:w="1872"/>
-        <w:gridCol w:w="1872"/>
-        <w:gridCol w:w="1872"/>
-        <w:gridCol w:w="1872"/>
-        <w:gridCol w:w="1872"/>
+        <w:gridCol w:w="9360"/>
       </w:tblGrid>
       <w:tr>
         <w:tc>
           <w:tcPr>
-            <w:tcW w:type="dxa" w:w="1872"/>
-            <w:shd w:fill="1F4E79"/>
+            <w:tcW w:type="dxa" w:w="9360"/>
+            <w:shd w:fill="fff7ed"/>
+            <w:tcMar>
+              <w:top w:w="140" w:type="dxa"/>
+              <w:bottom w:w="140" w:type="dxa"/>
+              <w:left w:w="200" w:type="dxa"/>
+              <w:right w:w="200" w:type="dxa"/>
+            </w:tcMar>
+            <w:tcBorders>
+              <w:top w:val="none"/>
+              <w:bottom w:val="none"/>
+              <w:left w:val="single" w:sz="24" w:space="0" w:color="f97316"/>
+              <w:right w:val="none"/>
+            </w:tcBorders>
           </w:tcPr>
           <w:p>
             <w:pPr>
-              <w:jc w:val="center"/>
+              <w:spacing w:before="0" w:after="0" w:line="276" w:lineRule="auto"/>
             </w:pPr>
             <w:r>
               <w:rPr>
+                <w:rFonts w:ascii="Calibri" w:hAnsi="Calibri"/>
                 <w:b/>
-                <w:color w:val="FFFFFF"/>
+                <w:color w:val="9A3412"/>
+                <w:sz w:val="21"/>
+              </w:rPr>
+              <w:t>📌 Principio de Calidad de Datos (Tratamiento del Target)</w:t>
+              <w:br/>
+            </w:r>
+            <w:r>
+              <w:rPr>
+                <w:rFonts w:ascii="Calibri" w:hAnsi="Calibri"/>
+                <w:color w:val="7C2D12"/>
                 <w:sz w:val="20"/>
               </w:rPr>
-              <w:t>Modelo</w:t>
+              <w:t>Se removieron comas y caracteres no numéricos en Unit Cost (INR) y se descartaron estrictamente las 2 observaciones con valor nulo (productos P0166 y P0119, ambos de BRAND_A). En aprendizaje supervisado, imputar la variable dependiente genera sesgos circulares que invalidan las métricas empíricas. El modelo se ajusta y evalúa únicamente sobre los 251 registros con etiqueta real comprobada.</w:t>
+            </w:r>
+          </w:p>
+        </w:tc>
+      </w:tr>
+    </w:tbl>
+    <w:p>
+      <w:pPr>
+        <w:spacing w:after="80"/>
+      </w:pPr>
+    </w:p>
+    <w:p>
+      <w:pPr>
+        <w:spacing w:before="360" w:after="20"/>
+      </w:pPr>
+      <w:r>
+        <w:rPr>
+          <w:rFonts w:ascii="Calibri" w:hAnsi="Calibri"/>
+          <w:b/>
+          <w:color w:val="2563EB"/>
+          <w:sz w:val="22"/>
+        </w:rPr>
+        <w:t>FASE 2</w:t>
+      </w:r>
+    </w:p>
+    <w:p>
+      <w:pPr>
+        <w:spacing w:before="0" w:after="160"/>
+      </w:pPr>
+      <w:r>
+        <w:rPr>
+          <w:rFonts w:ascii="Calibri" w:hAnsi="Calibri"/>
+          <w:b/>
+          <w:color w:val="1E3A8A"/>
+          <w:sz w:val="30"/>
+        </w:rPr>
+        <w:t>Ingeniería de Características y Taxonomía del Parser</w:t>
+      </w:r>
+    </w:p>
+    <w:p>
+      <w:pPr>
+        <w:spacing w:before="0" w:after="120" w:line="276" w:lineRule="auto"/>
+      </w:pPr>
+      <w:r>
+        <w:rPr>
+          <w:rFonts w:ascii="Calibri" w:hAnsi="Calibri"/>
+          <w:color w:val="1A1A2E"/>
+          <w:sz w:val="21"/>
+        </w:rPr>
+        <w:t>A partir de Product Name, se estructuró un extractor de expresiones regulares en tres niveles taxonómicos que resolvió el 100% de los 253 productos de catálogo sin introducir suposiciones universales arbitrarias:</w:t>
+      </w:r>
+    </w:p>
+    <w:tbl>
+      <w:tblPr>
+        <w:tblW w:type="auto" w:w="0"/>
+        <w:jc w:val="center"/>
+        <w:tblLook w:firstColumn="1" w:firstRow="1" w:lastColumn="0" w:lastRow="0" w:noHBand="0" w:noVBand="1" w:val="04A0"/>
+        <w:tblBorders>
+          <w:top w:val="single" w:sz="4" w:space="0" w:color="cbd5e1"/>
+          <w:bottom w:val="single" w:sz="6" w:space="0" w:color="cbd5e1"/>
+          <w:left w:val="none"/>
+          <w:right w:val="none"/>
+          <w:insideH w:val="single" w:sz="4" w:space="0" w:color="cbd5e1"/>
+          <w:insideV w:val="none"/>
+        </w:tblBorders>
+      </w:tblPr>
+      <w:tblGrid>
+        <w:gridCol w:w="2340"/>
+        <w:gridCol w:w="2340"/>
+        <w:gridCol w:w="2340"/>
+        <w:gridCol w:w="2340"/>
+      </w:tblGrid>
+      <w:tr>
+        <w:tc>
+          <w:tcPr>
+            <w:tcW w:type="dxa" w:w="2340"/>
+            <w:shd w:fill="eef2fb"/>
+            <w:tcMar>
+              <w:top w:w="120" w:type="dxa"/>
+              <w:bottom w:w="120" w:type="dxa"/>
+              <w:left w:w="140" w:type="dxa"/>
+              <w:right w:w="140" w:type="dxa"/>
+            </w:tcMar>
+          </w:tcPr>
+          <w:p>
+            <w:pPr>
+              <w:spacing w:after="0"/>
+            </w:pPr>
+            <w:r>
+              <w:rPr>
+                <w:rFonts w:ascii="Calibri" w:hAnsi="Calibri"/>
+                <w:b/>
+                <w:color w:val="1E3A8A"/>
+                <w:sz w:val="20"/>
+              </w:rPr>
+              <w:t>Nomenclatura / Categoría</w:t>
             </w:r>
           </w:p>
         </w:tc>
         <w:tc>
           <w:tcPr>
-            <w:tcW w:type="dxa" w:w="1872"/>
-            <w:shd w:fill="1F4E79"/>
+            <w:tcW w:type="dxa" w:w="2340"/>
+            <w:shd w:fill="eef2fb"/>
+            <w:tcMar>
+              <w:top w:w="120" w:type="dxa"/>
+              <w:bottom w:w="120" w:type="dxa"/>
+              <w:left w:w="140" w:type="dxa"/>
+              <w:right w:w="140" w:type="dxa"/>
+            </w:tcMar>
           </w:tcPr>
           <w:p>
             <w:pPr>
+              <w:spacing w:after="0"/>
+            </w:pPr>
+            <w:r>
+              <w:rPr>
+                <w:rFonts w:ascii="Calibri" w:hAnsi="Calibri"/>
+                <w:b/>
+                <w:color w:val="1E3A8A"/>
+                <w:sz w:val="20"/>
+              </w:rPr>
+              <w:t>Casos</w:t>
+            </w:r>
+          </w:p>
+        </w:tc>
+        <w:tc>
+          <w:tcPr>
+            <w:tcW w:type="dxa" w:w="2340"/>
+            <w:shd w:fill="eef2fb"/>
+            <w:tcMar>
+              <w:top w:w="120" w:type="dxa"/>
+              <w:bottom w:w="120" w:type="dxa"/>
+              <w:left w:w="140" w:type="dxa"/>
+              <w:right w:w="140" w:type="dxa"/>
+            </w:tcMar>
+          </w:tcPr>
+          <w:p>
+            <w:pPr>
+              <w:spacing w:after="0"/>
+            </w:pPr>
+            <w:r>
+              <w:rPr>
+                <w:rFonts w:ascii="Calibri" w:hAnsi="Calibri"/>
+                <w:b/>
+                <w:color w:val="1E3A8A"/>
+                <w:sz w:val="20"/>
+              </w:rPr>
+              <w:t>Regla de Extracción / Deducción</w:t>
+            </w:r>
+          </w:p>
+        </w:tc>
+        <w:tc>
+          <w:tcPr>
+            <w:tcW w:type="dxa" w:w="2340"/>
+            <w:shd w:fill="eef2fb"/>
+            <w:tcMar>
+              <w:top w:w="120" w:type="dxa"/>
+              <w:bottom w:w="120" w:type="dxa"/>
+              <w:left w:w="140" w:type="dxa"/>
+              <w:right w:w="140" w:type="dxa"/>
+            </w:tcMar>
+          </w:tcPr>
+          <w:p>
+            <w:pPr>
+              <w:spacing w:after="0"/>
+            </w:pPr>
+            <w:r>
+              <w:rPr>
+                <w:rFonts w:ascii="Calibri" w:hAnsi="Calibri"/>
+                <w:b/>
+                <w:color w:val="1E3A8A"/>
+                <w:sz w:val="20"/>
+              </w:rPr>
+              <w:t>Ejemplo Real</w:t>
+            </w:r>
+          </w:p>
+        </w:tc>
+      </w:tr>
+      <w:tr>
+        <w:tc>
+          <w:tcPr>
+            <w:tcW w:type="dxa" w:w="2340"/>
+            <w:tcMar>
+              <w:top w:w="100" w:type="dxa"/>
+              <w:bottom w:w="100" w:type="dxa"/>
+              <w:left w:w="120" w:type="dxa"/>
+              <w:right w:w="120" w:type="dxa"/>
+            </w:tcMar>
+          </w:tcPr>
+          <w:p>
+            <w:pPr>
+              <w:spacing w:after="0"/>
+            </w:pPr>
+            <w:r>
+              <w:rPr>
+                <w:rFonts w:ascii="Calibri" w:hAnsi="Calibri"/>
+                <w:sz w:val="19"/>
+              </w:rPr>
+              <w:t>Métrico Estándar y ZR</w:t>
+            </w:r>
+          </w:p>
+        </w:tc>
+        <w:tc>
+          <w:tcPr>
+            <w:tcW w:type="dxa" w:w="2340"/>
+            <w:tcMar>
+              <w:top w:w="100" w:type="dxa"/>
+              <w:bottom w:w="100" w:type="dxa"/>
+              <w:left w:w="120" w:type="dxa"/>
+              <w:right w:w="120" w:type="dxa"/>
+            </w:tcMar>
+          </w:tcPr>
+          <w:p>
+            <w:pPr>
+              <w:spacing w:after="0"/>
+            </w:pPr>
+            <w:r>
+              <w:rPr>
+                <w:rFonts w:ascii="Calibri" w:hAnsi="Calibri"/>
+                <w:sz w:val="19"/>
+              </w:rPr>
+              <w:t>218</w:t>
+            </w:r>
+          </w:p>
+        </w:tc>
+        <w:tc>
+          <w:tcPr>
+            <w:tcW w:type="dxa" w:w="2340"/>
+            <w:tcMar>
+              <w:top w:w="100" w:type="dxa"/>
+              <w:bottom w:w="100" w:type="dxa"/>
+              <w:left w:w="120" w:type="dxa"/>
+              <w:right w:w="120" w:type="dxa"/>
+            </w:tcMar>
+          </w:tcPr>
+          <w:p>
+            <w:pPr>
+              <w:spacing w:after="0"/>
+            </w:pPr>
+            <w:r>
+              <w:rPr>
+                <w:rFonts w:ascii="Calibri" w:hAnsi="Calibri"/>
+                <w:sz w:val="19"/>
+              </w:rPr>
+              <w:t>Width en mm, Rim en pulgadas y Ratio explícito tras la barra '/'</w:t>
+              <w:br/>
+              <w:t>Regla: (?P&lt;w&gt;\d{3})/(?P&lt;ar&gt;\d{2})\s*(?:Z?\s*R)\s*(?P&lt;rim&gt;\d{2})</w:t>
+            </w:r>
+          </w:p>
+        </w:tc>
+        <w:tc>
+          <w:tcPr>
+            <w:tcW w:type="dxa" w:w="2340"/>
+            <w:tcMar>
+              <w:top w:w="100" w:type="dxa"/>
+              <w:bottom w:w="100" w:type="dxa"/>
+              <w:left w:w="120" w:type="dxa"/>
+              <w:right w:w="120" w:type="dxa"/>
+            </w:tcMar>
+          </w:tcPr>
+          <w:p>
+            <w:pPr>
+              <w:spacing w:after="0"/>
+            </w:pPr>
+            <w:r>
+              <w:rPr>
+                <w:rFonts w:ascii="Calibri" w:hAnsi="Calibri"/>
+                <w:sz w:val="19"/>
+              </w:rPr>
+              <w:t>145/70 R 12 BY-801</w:t>
+              <w:br/>
+              <w:t>225/40 Z R 19 TR41</w:t>
+            </w:r>
+          </w:p>
+        </w:tc>
+      </w:tr>
+      <w:tr>
+        <w:tc>
+          <w:tcPr>
+            <w:tcW w:type="dxa" w:w="2340"/>
+            <w:tcMar>
+              <w:top w:w="100" w:type="dxa"/>
+              <w:bottom w:w="100" w:type="dxa"/>
+              <w:left w:w="120" w:type="dxa"/>
+              <w:right w:w="120" w:type="dxa"/>
+            </w:tcMar>
+          </w:tcPr>
+          <w:p>
+            <w:pPr>
+              <w:spacing w:after="0"/>
+            </w:pPr>
+            <w:r>
+              <w:rPr>
+                <w:rFonts w:ascii="Calibri" w:hAnsi="Calibri"/>
+                <w:sz w:val="19"/>
+              </w:rPr>
+              <w:t>Flotación en Pulgadas</w:t>
+            </w:r>
+          </w:p>
+        </w:tc>
+        <w:tc>
+          <w:tcPr>
+            <w:tcW w:type="dxa" w:w="2340"/>
+            <w:tcMar>
+              <w:top w:w="100" w:type="dxa"/>
+              <w:bottom w:w="100" w:type="dxa"/>
+              <w:left w:w="120" w:type="dxa"/>
+              <w:right w:w="120" w:type="dxa"/>
+            </w:tcMar>
+          </w:tcPr>
+          <w:p>
+            <w:pPr>
+              <w:spacing w:after="0"/>
+            </w:pPr>
+            <w:r>
+              <w:rPr>
+                <w:rFonts w:ascii="Calibri" w:hAnsi="Calibri"/>
+                <w:sz w:val="19"/>
+              </w:rPr>
+              <w:t>11</w:t>
+            </w:r>
+          </w:p>
+        </w:tc>
+        <w:tc>
+          <w:tcPr>
+            <w:tcW w:type="dxa" w:w="2340"/>
+            <w:tcMar>
+              <w:top w:w="100" w:type="dxa"/>
+              <w:bottom w:w="100" w:type="dxa"/>
+              <w:left w:w="120" w:type="dxa"/>
+              <w:right w:w="120" w:type="dxa"/>
+            </w:tcMar>
+          </w:tcPr>
+          <w:p>
+            <w:pPr>
+              <w:spacing w:after="0"/>
+            </w:pPr>
+            <w:r>
+              <w:rPr>
+                <w:rFonts w:ascii="Calibri" w:hAnsi="Calibri"/>
+                <w:sz w:val="19"/>
+              </w:rPr>
+              <w:t>Width = W × 25.4 mm. Ratio geométrico deducido:</w:t>
+              <w:br/>
+              <w:t>H = (OD - Rim)/2  =&gt;  Ratio = (H / W) × 100</w:t>
+            </w:r>
+          </w:p>
+        </w:tc>
+        <w:tc>
+          <w:tcPr>
+            <w:tcW w:type="dxa" w:w="2340"/>
+            <w:tcMar>
+              <w:top w:w="100" w:type="dxa"/>
+              <w:bottom w:w="100" w:type="dxa"/>
+              <w:left w:w="120" w:type="dxa"/>
+              <w:right w:w="120" w:type="dxa"/>
+            </w:tcMar>
+          </w:tcPr>
+          <w:p>
+            <w:pPr>
+              <w:spacing w:after="0"/>
+            </w:pPr>
+            <w:r>
+              <w:rPr>
+                <w:rFonts w:ascii="Calibri" w:hAnsi="Calibri"/>
+                <w:sz w:val="19"/>
+              </w:rPr>
+              <w:t>31 x 10.50 R 15 LT</w:t>
+              <w:br/>
+              <w:t>(Ratio = 76,19%)</w:t>
+            </w:r>
+          </w:p>
+        </w:tc>
+      </w:tr>
+      <w:tr>
+        <w:tc>
+          <w:tcPr>
+            <w:tcW w:type="dxa" w:w="2340"/>
+            <w:tcMar>
+              <w:top w:w="100" w:type="dxa"/>
+              <w:bottom w:w="100" w:type="dxa"/>
+              <w:left w:w="120" w:type="dxa"/>
+              <w:right w:w="120" w:type="dxa"/>
+            </w:tcMar>
+          </w:tcPr>
+          <w:p>
+            <w:pPr>
+              <w:spacing w:after="0"/>
+            </w:pPr>
+            <w:r>
+              <w:rPr>
+                <w:rFonts w:ascii="Calibri" w:hAnsi="Calibri"/>
+                <w:sz w:val="19"/>
+              </w:rPr>
+              <w:t>Comercial Ligero (Tipo C)</w:t>
+            </w:r>
+          </w:p>
+        </w:tc>
+        <w:tc>
+          <w:tcPr>
+            <w:tcW w:type="dxa" w:w="2340"/>
+            <w:tcMar>
+              <w:top w:w="100" w:type="dxa"/>
+              <w:bottom w:w="100" w:type="dxa"/>
+              <w:left w:w="120" w:type="dxa"/>
+              <w:right w:w="120" w:type="dxa"/>
+            </w:tcMar>
+          </w:tcPr>
+          <w:p>
+            <w:pPr>
+              <w:spacing w:after="0"/>
+            </w:pPr>
+            <w:r>
+              <w:rPr>
+                <w:rFonts w:ascii="Calibri" w:hAnsi="Calibri"/>
+                <w:sz w:val="19"/>
+              </w:rPr>
+              <w:t>18</w:t>
+            </w:r>
+          </w:p>
+        </w:tc>
+        <w:tc>
+          <w:tcPr>
+            <w:tcW w:type="dxa" w:w="2340"/>
+            <w:tcMar>
+              <w:top w:w="100" w:type="dxa"/>
+              <w:bottom w:w="100" w:type="dxa"/>
+              <w:left w:w="120" w:type="dxa"/>
+              <w:right w:w="120" w:type="dxa"/>
+            </w:tcMar>
+          </w:tcPr>
+          <w:p>
+            <w:pPr>
+              <w:spacing w:after="0"/>
+            </w:pPr>
+            <w:r>
+              <w:rPr>
+                <w:rFonts w:ascii="Calibri" w:hAnsi="Calibri"/>
+                <w:sz w:val="19"/>
+              </w:rPr>
+              <w:t>Width en mm, Rim en pulgadas. Sin ratio en texto: asigna NaN</w:t>
+              <w:br/>
+              <w:t>(No inventa 80% arbitrario)</w:t>
+            </w:r>
+          </w:p>
+        </w:tc>
+        <w:tc>
+          <w:tcPr>
+            <w:tcW w:type="dxa" w:w="2340"/>
+            <w:tcMar>
+              <w:top w:w="100" w:type="dxa"/>
+              <w:bottom w:w="100" w:type="dxa"/>
+              <w:left w:w="120" w:type="dxa"/>
+              <w:right w:w="120" w:type="dxa"/>
+            </w:tcMar>
+          </w:tcPr>
+          <w:p>
+            <w:pPr>
+              <w:spacing w:after="0"/>
+            </w:pPr>
+            <w:r>
+              <w:rPr>
+                <w:rFonts w:ascii="Calibri" w:hAnsi="Calibri"/>
+                <w:sz w:val="19"/>
+              </w:rPr>
+              <w:t>155 R 12 C / 8PR BY-05</w:t>
+            </w:r>
+          </w:p>
+        </w:tc>
+      </w:tr>
+      <w:tr>
+        <w:tc>
+          <w:tcPr>
+            <w:tcW w:type="dxa" w:w="2340"/>
+            <w:tcMar>
+              <w:top w:w="100" w:type="dxa"/>
+              <w:bottom w:w="100" w:type="dxa"/>
+              <w:left w:w="120" w:type="dxa"/>
+              <w:right w:w="120" w:type="dxa"/>
+            </w:tcMar>
+          </w:tcPr>
+          <w:p>
+            <w:pPr>
+              <w:spacing w:after="0"/>
+            </w:pPr>
+            <w:r>
+              <w:rPr>
+                <w:rFonts w:ascii="Calibri" w:hAnsi="Calibri"/>
+                <w:sz w:val="19"/>
+              </w:rPr>
+              <w:t>Camión Pesado (1000R / 11R)</w:t>
+            </w:r>
+          </w:p>
+        </w:tc>
+        <w:tc>
+          <w:tcPr>
+            <w:tcW w:type="dxa" w:w="2340"/>
+            <w:tcMar>
+              <w:top w:w="100" w:type="dxa"/>
+              <w:bottom w:w="100" w:type="dxa"/>
+              <w:left w:w="120" w:type="dxa"/>
+              <w:right w:w="120" w:type="dxa"/>
+            </w:tcMar>
+          </w:tcPr>
+          <w:p>
+            <w:pPr>
+              <w:spacing w:after="0"/>
+            </w:pPr>
+            <w:r>
+              <w:rPr>
+                <w:rFonts w:ascii="Calibri" w:hAnsi="Calibri"/>
+                <w:sz w:val="19"/>
+              </w:rPr>
+              <w:t>6</w:t>
+            </w:r>
+          </w:p>
+        </w:tc>
+        <w:tc>
+          <w:tcPr>
+            <w:tcW w:type="dxa" w:w="2340"/>
+            <w:tcMar>
+              <w:top w:w="100" w:type="dxa"/>
+              <w:bottom w:w="100" w:type="dxa"/>
+              <w:left w:w="120" w:type="dxa"/>
+              <w:right w:w="120" w:type="dxa"/>
+            </w:tcMar>
+          </w:tcPr>
+          <w:p>
+            <w:pPr>
+              <w:spacing w:after="0"/>
+            </w:pPr>
+            <w:r>
+              <w:rPr>
+                <w:rFonts w:ascii="Calibri" w:hAnsi="Calibri"/>
+                <w:sz w:val="19"/>
+              </w:rPr>
+              <w:t>1000 -&gt; 10.00 in (254 mm); 11 -&gt; 11.00 in (279.4 mm). Asigna NaN</w:t>
+            </w:r>
+          </w:p>
+        </w:tc>
+        <w:tc>
+          <w:tcPr>
+            <w:tcW w:type="dxa" w:w="2340"/>
+            <w:tcMar>
+              <w:top w:w="100" w:type="dxa"/>
+              <w:bottom w:w="100" w:type="dxa"/>
+              <w:left w:w="120" w:type="dxa"/>
+              <w:right w:w="120" w:type="dxa"/>
+            </w:tcMar>
+          </w:tcPr>
+          <w:p>
+            <w:pPr>
+              <w:spacing w:after="0"/>
+            </w:pPr>
+            <w:r>
+              <w:rPr>
+                <w:rFonts w:ascii="Calibri" w:hAnsi="Calibri"/>
+                <w:sz w:val="19"/>
+              </w:rPr>
+              <w:t>1000 R 20 / 18PR</w:t>
+              <w:br/>
+              <w:t>11 R 22.5 / 18PR</w:t>
+            </w:r>
+          </w:p>
+        </w:tc>
+      </w:tr>
+    </w:tbl>
+    <w:p>
+      <w:pPr>
+        <w:spacing w:after="120"/>
+      </w:pPr>
+    </w:p>
+    <w:tbl>
+      <w:tblPr>
+        <w:tblW w:type="auto" w:w="0"/>
+        <w:jc w:val="center"/>
+        <w:tblLook w:firstColumn="1" w:firstRow="1" w:lastColumn="0" w:lastRow="0" w:noHBand="0" w:noVBand="1" w:val="04A0"/>
+      </w:tblPr>
+      <w:tblGrid>
+        <w:gridCol w:w="9360"/>
+      </w:tblGrid>
+      <w:tr>
+        <w:tc>
+          <w:tcPr>
+            <w:tcW w:type="dxa" w:w="9360"/>
+            <w:shd w:fill="fff7ed"/>
+            <w:tcMar>
+              <w:top w:w="140" w:type="dxa"/>
+              <w:bottom w:w="140" w:type="dxa"/>
+              <w:left w:w="200" w:type="dxa"/>
+              <w:right w:w="200" w:type="dxa"/>
+            </w:tcMar>
+            <w:tcBorders>
+              <w:top w:val="none"/>
+              <w:bottom w:val="none"/>
+              <w:left w:val="single" w:sz="24" w:space="0" w:color="f97316"/>
+              <w:right w:val="none"/>
+            </w:tcBorders>
+          </w:tcPr>
+          <w:p>
+            <w:pPr>
+              <w:spacing w:before="0" w:after="0" w:line="276" w:lineRule="auto"/>
+            </w:pPr>
+            <w:r>
+              <w:rPr>
+                <w:rFonts w:ascii="Calibri" w:hAnsi="Calibri"/>
+                <w:b/>
+                <w:color w:val="9A3412"/>
+                <w:sz w:val="21"/>
+              </w:rPr>
+              <w:t>📌 Principio de Diseño 1: Prevención de Fuga de Datos (Data Leakage)</w:t>
+              <w:br/>
+            </w:r>
+            <w:r>
+              <w:rPr>
+                <w:rFonts w:ascii="Calibri" w:hAnsi="Calibri"/>
+                <w:color w:val="7C2D12"/>
+                <w:sz w:val="20"/>
+              </w:rPr>
+              <w:t>Cualquier estadístico de centralidad o dispersión (media, mediana, desvío) constituye un parámetro aprendido del dataset. Calcular la mediana sobre el total del catálogo antes de la partición filtra información del conjunto de prueba hacia el entrenamiento, produciendo métricas sobreoptimistas. Por ello, se ejecutó primero train_test_split, se calculó la mediana de Aspect Ratio exclusivamente sobre Train (65,00%), y dicho parámetro estático se aplicó para imputar los faltantes de Train y Test de forma independiente.</w:t>
+            </w:r>
+          </w:p>
+        </w:tc>
+      </w:tr>
+    </w:tbl>
+    <w:p>
+      <w:pPr>
+        <w:spacing w:after="80"/>
+      </w:pPr>
+    </w:p>
+    <w:tbl>
+      <w:tblPr>
+        <w:tblW w:type="auto" w:w="0"/>
+        <w:jc w:val="center"/>
+        <w:tblLook w:firstColumn="1" w:firstRow="1" w:lastColumn="0" w:lastRow="0" w:noHBand="0" w:noVBand="1" w:val="04A0"/>
+      </w:tblPr>
+      <w:tblGrid>
+        <w:gridCol w:w="9360"/>
+      </w:tblGrid>
+      <w:tr>
+        <w:tc>
+          <w:tcPr>
+            <w:tcW w:type="dxa" w:w="9360"/>
+            <w:shd w:fill="fff7ed"/>
+            <w:tcMar>
+              <w:top w:w="140" w:type="dxa"/>
+              <w:bottom w:w="140" w:type="dxa"/>
+              <w:left w:w="200" w:type="dxa"/>
+              <w:right w:w="200" w:type="dxa"/>
+            </w:tcMar>
+            <w:tcBorders>
+              <w:top w:val="none"/>
+              <w:bottom w:val="none"/>
+              <w:left w:val="single" w:sz="24" w:space="0" w:color="f97316"/>
+              <w:right w:val="none"/>
+            </w:tcBorders>
+          </w:tcPr>
+          <w:p>
+            <w:pPr>
+              <w:spacing w:before="0" w:after="0" w:line="276" w:lineRule="auto"/>
+            </w:pPr>
+            <w:r>
+              <w:rPr>
+                <w:rFonts w:ascii="Calibri" w:hAnsi="Calibri"/>
+                <w:b/>
+                <w:color w:val="9A3412"/>
+                <w:sz w:val="21"/>
+              </w:rPr>
+              <w:t>📌 Principio de Diseño 2: Trampa de Multicolinealidad y Dummy Base</w:t>
+              <w:br/>
+            </w:r>
+            <w:r>
+              <w:rPr>
+                <w:rFonts w:ascii="Calibri" w:hAnsi="Calibri"/>
+                <w:color w:val="7C2D12"/>
+                <w:sz w:val="20"/>
+              </w:rPr>
+              <w:t>En regresión lineal con intercepto (beta_0), incluir variables binarias para todas las marcas produce una combinación lineal perfecta (la suma de las columnas es igual a 1, coincidiendo con el vector de unos del intercepto). Esto colapsa el determinante de la matriz X'X haciéndola no invertible. Para evitarlo, se utilizó One-Hot Encoding omitiendo explícitamente a BRAND_A como categoría base (drop_first). El intercepto beta_0 representa el costo base de un neumático BRAND_A, y los coeficientes de BRAND_B, BRAND_C y BRAND_D miden diferenciales directos de costo.</w:t>
+            </w:r>
+          </w:p>
+        </w:tc>
+      </w:tr>
+    </w:tbl>
+    <w:p>
+      <w:pPr>
+        <w:spacing w:after="80"/>
+      </w:pPr>
+    </w:p>
+    <w:p>
+      <w:pPr>
+        <w:spacing w:before="360" w:after="20"/>
+      </w:pPr>
+      <w:r>
+        <w:rPr>
+          <w:rFonts w:ascii="Calibri" w:hAnsi="Calibri"/>
+          <w:b/>
+          <w:color w:val="2563EB"/>
+          <w:sz w:val="22"/>
+        </w:rPr>
+        <w:t>FASE 3</w:t>
+      </w:r>
+    </w:p>
+    <w:p>
+      <w:pPr>
+        <w:spacing w:before="0" w:after="160"/>
+      </w:pPr>
+      <w:r>
+        <w:rPr>
+          <w:rFonts w:ascii="Calibri" w:hAnsi="Calibri"/>
+          <w:b/>
+          <w:color w:val="1E3A8A"/>
+          <w:sz w:val="30"/>
+        </w:rPr>
+        <w:t>Partición de Datos y Decisión Metodológica sobre Escalado</w:t>
+      </w:r>
+    </w:p>
+    <w:p>
+      <w:pPr>
+        <w:spacing w:before="0" w:after="120" w:line="276" w:lineRule="auto"/>
+      </w:pPr>
+      <w:r>
+        <w:rPr>
+          <w:rFonts w:ascii="Calibri" w:hAnsi="Calibri"/>
+          <w:color w:val="1A1A2E"/>
+          <w:sz w:val="21"/>
+        </w:rPr>
+        <w:t>• Partición de Datos: Se empleó train_test_split(test_size=0.20, random_state=42). Debido a la naturaleza discreta de N=251, la división arrojó exactamente 200 observaciones en Entrenamiento (79,68%) y 51 observaciones en Prueba (20,32%).</w:t>
+        <w:br/>
+        <w:br/>
+        <w:t>• Justificación de la No Estandarización (Invarianza OLS):</w:t>
+        <w:br/>
+        <w:t>A diferencia de algoritmos basados en cálculo de distancias (KNN, SVM, K-Means) o modelos linealmente regularizados con penalización (Ridge, Lasso), la solución analítica de Mínimos Cuadrados Ordinarios [beta = (X'X)^(-1) X'y] es invariante a transformaciones lineales de escala. Estandarizar las variables predictoras no modifica el hiperplano óptimo, ni las predicciones puntuales, ni los residuos, ni el coeficiente R². Mantener las unidades originales (pulgadas para rin, milímetros para ancho, porcentaje para perfil) permite conservar la interpretabilidad económica directa de los coeficientes en INR por unidad de medida física, preservando la transparencia pedagógica del Colab de la cátedra.</w:t>
+      </w:r>
+    </w:p>
+    <w:p>
+      <w:pPr>
+        <w:spacing w:before="360" w:after="20"/>
+      </w:pPr>
+      <w:r>
+        <w:rPr>
+          <w:rFonts w:ascii="Calibri" w:hAnsi="Calibri"/>
+          <w:b/>
+          <w:color w:val="2563EB"/>
+          <w:sz w:val="22"/>
+        </w:rPr>
+        <w:t>FASE 4</w:t>
+      </w:r>
+    </w:p>
+    <w:p>
+      <w:pPr>
+        <w:spacing w:before="0" w:after="160"/>
+      </w:pPr>
+      <w:r>
+        <w:rPr>
+          <w:rFonts w:ascii="Calibri" w:hAnsi="Calibri"/>
+          <w:b/>
+          <w:color w:val="1E3A8A"/>
+          <w:sz w:val="30"/>
+        </w:rPr>
+        <w:t>Modelado, Coeficientes y Evaluación sobre Test (N=51)</w:t>
+      </w:r>
+    </w:p>
+    <w:p>
+      <w:pPr>
+        <w:spacing w:before="160" w:after="60"/>
+      </w:pPr>
+      <w:r>
+        <w:rPr>
+          <w:rFonts w:ascii="Calibri" w:hAnsi="Calibri"/>
+          <w:b/>
+          <w:color w:val="1E3A8A"/>
+          <w:sz w:val="22"/>
+        </w:rPr>
+        <w:t>4.1 Modelo 1: Regresión Lineal Simple (Baseline)</w:t>
+      </w:r>
+    </w:p>
+    <w:p>
+      <w:pPr>
+        <w:spacing w:before="0" w:after="120" w:line="276" w:lineRule="auto"/>
+      </w:pPr>
+      <w:r>
+        <w:rPr>
+          <w:rFonts w:ascii="Calibri" w:hAnsi="Calibri"/>
+          <w:color w:val="1A1A2E"/>
+          <w:sz w:val="21"/>
+        </w:rPr>
+        <w:t>Ajustado sobre Train utilizando únicamente el predictor individual más correlacionado:</w:t>
+        <w:br/>
+        <w:t>Ecuación:  Costo_Estimado = -22.783,89 + 1.957,17 · Rim</w:t>
+        <w:br/>
+        <w:t>Lectura Técnica: Por cada pulgada adicional en el diámetro del rin, el costo unitario esperado aumenta en promedio $1.957,17 INR.</w:t>
+      </w:r>
+    </w:p>
+    <w:p>
+      <w:pPr>
+        <w:spacing w:before="160" w:after="60"/>
+      </w:pPr>
+      <w:r>
+        <w:rPr>
+          <w:rFonts w:ascii="Calibri" w:hAnsi="Calibri"/>
+          <w:b/>
+          <w:color w:val="1E3A8A"/>
+          <w:sz w:val="22"/>
+        </w:rPr>
+        <w:t>4.2 Modelo 2: Regresión Lineal Múltiple (Integrador)</w:t>
+      </w:r>
+    </w:p>
+    <w:p>
+      <w:pPr>
+        <w:spacing w:before="0" w:after="120" w:line="276" w:lineRule="auto"/>
+      </w:pPr>
+      <w:r>
+        <w:rPr>
+          <w:rFonts w:ascii="Calibri" w:hAnsi="Calibri"/>
+          <w:color w:val="1A1A2E"/>
+          <w:sz w:val="21"/>
+        </w:rPr>
+        <w:t>Incorpora la geometría física tridimensional y el factor fabricante (Base de referencia: BRAND_A):</w:t>
+        <w:br/>
+        <w:t>Ecuación:  Costo_Estimado = -34.926,44 + 1.498,42 · Rim + 24,09 · Width + 223,70 · Ratio + 468,73 · B_B - 1.070,51 · B_C + 4.821,93 · B_D</w:t>
+        <w:br/>
+        <w:br/>
+        <w:t>Lectura Técnica de Coeficientes:</w:t>
+        <w:br/>
+        <w:t>• Rim (+1.498,42 INR/pulgada): Manteniendo las demás dimensiones y marca constantes, cada pulgada adicional de rin incrementa el costo en $1.498 INR.</w:t>
+        <w:br/>
+        <w:t>• Width (+24,09 INR/mm): Cada milímetro extra de ancho de banda de rodadura incrementa el costo en $24,09 INR.</w:t>
+        <w:br/>
+        <w:t>• Ratio (+223,70 INR/%): Cada punto porcentual de perfil añade $223,70 INR.</w:t>
+        <w:br/>
+        <w:t>• BRAND_B (+468,73 INR): Presenta un sobreprecio moderado respecto a BRAND_A.</w:t>
+        <w:br/>
+        <w:t>• BRAND_C (-1.070,51 INR): Confirma cuantitativamente su perfil económico, costando en promedio $1.070 INR menos que BRAND_A a iguales medidas.</w:t>
+        <w:br/>
+        <w:t>• BRAND_D (+4.821,93 INR): Evidencia un recargo muy pronunciado, justificado por su especialización en cubiertas de carga pesada e industrial.</w:t>
+      </w:r>
+    </w:p>
+    <w:p>
+      <w:pPr>
+        <w:spacing w:before="240" w:after="80"/>
+      </w:pPr>
+      <w:r>
+        <w:rPr>
+          <w:rFonts w:ascii="Calibri" w:hAnsi="Calibri"/>
+          <w:b/>
+          <w:color w:val="1E3A8A"/>
+          <w:sz w:val="25"/>
+        </w:rPr>
+        <w:t>4.3 Tabla Comparativa de Métricas Oficiales sobre Test (N=51)</w:t>
+      </w:r>
+    </w:p>
+    <w:p>
+      <w:pPr>
+        <w:spacing w:before="0" w:after="120" w:line="276" w:lineRule="auto"/>
+      </w:pPr>
+      <w:r>
+        <w:rPr>
+          <w:rFonts w:ascii="Calibri" w:hAnsi="Calibri"/>
+          <w:color w:val="1A1A2E"/>
+          <w:sz w:val="21"/>
+        </w:rPr>
+        <w:t>Las métricas fueron calculadas estrictamente sobre las 51 observaciones de prueba independientes nunca observadas durante el entrenamiento:</w:t>
+      </w:r>
+    </w:p>
+    <w:tbl>
+      <w:tblPr>
+        <w:tblW w:type="auto" w:w="0"/>
+        <w:jc w:val="center"/>
+        <w:tblLook w:firstColumn="1" w:firstRow="1" w:lastColumn="0" w:lastRow="0" w:noHBand="0" w:noVBand="1" w:val="04A0"/>
+        <w:tblBorders>
+          <w:top w:val="single" w:sz="4" w:space="0" w:color="cbd5e1"/>
+          <w:bottom w:val="single" w:sz="6" w:space="0" w:color="cbd5e1"/>
+          <w:left w:val="none"/>
+          <w:right w:val="none"/>
+          <w:insideH w:val="single" w:sz="4" w:space="0" w:color="cbd5e1"/>
+          <w:insideV w:val="none"/>
+        </w:tblBorders>
+      </w:tblPr>
+      <w:tblGrid>
+        <w:gridCol w:w="1560"/>
+        <w:gridCol w:w="1560"/>
+        <w:gridCol w:w="1560"/>
+        <w:gridCol w:w="1560"/>
+        <w:gridCol w:w="1560"/>
+        <w:gridCol w:w="1560"/>
+      </w:tblGrid>
+      <w:tr>
+        <w:tc>
+          <w:tcPr>
+            <w:tcW w:type="dxa" w:w="1560"/>
+            <w:shd w:fill="eef2fb"/>
+            <w:tcMar>
+              <w:top w:w="120" w:type="dxa"/>
+              <w:bottom w:w="120" w:type="dxa"/>
+              <w:left w:w="120" w:type="dxa"/>
+              <w:right w:w="120" w:type="dxa"/>
+            </w:tcMar>
+          </w:tcPr>
+          <w:p>
+            <w:pPr>
+              <w:spacing w:after="0"/>
               <w:jc w:val="center"/>
             </w:pPr>
             <w:r>
               <w:rPr>
+                <w:rFonts w:ascii="Calibri" w:hAnsi="Calibri"/>
                 <w:b/>
-                <w:color w:val="FFFFFF"/>
+                <w:color w:val="1E3A8A"/>
+                <w:sz w:val="20"/>
+              </w:rPr>
+              <w:t>Modelo Evaluado</w:t>
+            </w:r>
+          </w:p>
+        </w:tc>
+        <w:tc>
+          <w:tcPr>
+            <w:tcW w:type="dxa" w:w="1560"/>
+            <w:shd w:fill="eef2fb"/>
+            <w:tcMar>
+              <w:top w:w="120" w:type="dxa"/>
+              <w:bottom w:w="120" w:type="dxa"/>
+              <w:left w:w="120" w:type="dxa"/>
+              <w:right w:w="120" w:type="dxa"/>
+            </w:tcMar>
+          </w:tcPr>
+          <w:p>
+            <w:pPr>
+              <w:spacing w:after="0"/>
+              <w:jc w:val="center"/>
+            </w:pPr>
+            <w:r>
+              <w:rPr>
+                <w:rFonts w:ascii="Calibri" w:hAnsi="Calibri"/>
+                <w:b/>
+                <w:color w:val="1E3A8A"/>
                 <w:sz w:val="20"/>
               </w:rPr>
               <w:t>MAE (INR)</w:t>
@@ -385,17 +1633,25 @@
         </w:tc>
         <w:tc>
           <w:tcPr>
-            <w:tcW w:type="dxa" w:w="1872"/>
-            <w:shd w:fill="1F4E79"/>
+            <w:tcW w:type="dxa" w:w="1560"/>
+            <w:shd w:fill="eef2fb"/>
+            <w:tcMar>
+              <w:top w:w="120" w:type="dxa"/>
+              <w:bottom w:w="120" w:type="dxa"/>
+              <w:left w:w="120" w:type="dxa"/>
+              <w:right w:w="120" w:type="dxa"/>
+            </w:tcMar>
           </w:tcPr>
           <w:p>
             <w:pPr>
+              <w:spacing w:after="0"/>
               <w:jc w:val="center"/>
             </w:pPr>
             <w:r>
               <w:rPr>
+                <w:rFonts w:ascii="Calibri" w:hAnsi="Calibri"/>
                 <w:b/>
-                <w:color w:val="FFFFFF"/>
+                <w:color w:val="1E3A8A"/>
                 <w:sz w:val="20"/>
               </w:rPr>
               <w:t>MSE</w:t>
@@ -404,17 +1660,25 @@
         </w:tc>
         <w:tc>
           <w:tcPr>
-            <w:tcW w:type="dxa" w:w="1872"/>
-            <w:shd w:fill="1F4E79"/>
+            <w:tcW w:type="dxa" w:w="1560"/>
+            <w:shd w:fill="eef2fb"/>
+            <w:tcMar>
+              <w:top w:w="120" w:type="dxa"/>
+              <w:bottom w:w="120" w:type="dxa"/>
+              <w:left w:w="120" w:type="dxa"/>
+              <w:right w:w="120" w:type="dxa"/>
+            </w:tcMar>
           </w:tcPr>
           <w:p>
             <w:pPr>
+              <w:spacing w:after="0"/>
               <w:jc w:val="center"/>
             </w:pPr>
             <w:r>
               <w:rPr>
+                <w:rFonts w:ascii="Calibri" w:hAnsi="Calibri"/>
                 <w:b/>
-                <w:color w:val="FFFFFF"/>
+                <w:color w:val="1E3A8A"/>
                 <w:sz w:val="20"/>
               </w:rPr>
               <w:t>RMSE (INR)</w:t>
@@ -423,20 +1687,55 @@
         </w:tc>
         <w:tc>
           <w:tcPr>
-            <w:tcW w:type="dxa" w:w="1872"/>
-            <w:shd w:fill="1F4E79"/>
+            <w:tcW w:type="dxa" w:w="1560"/>
+            <w:shd w:fill="eef2fb"/>
+            <w:tcMar>
+              <w:top w:w="120" w:type="dxa"/>
+              <w:bottom w:w="120" w:type="dxa"/>
+              <w:left w:w="120" w:type="dxa"/>
+              <w:right w:w="120" w:type="dxa"/>
+            </w:tcMar>
           </w:tcPr>
           <w:p>
             <w:pPr>
+              <w:spacing w:after="0"/>
               <w:jc w:val="center"/>
             </w:pPr>
             <w:r>
               <w:rPr>
+                <w:rFonts w:ascii="Calibri" w:hAnsi="Calibri"/>
                 <w:b/>
-                <w:color w:val="FFFFFF"/>
+                <w:color w:val="1E3A8A"/>
                 <w:sz w:val="20"/>
               </w:rPr>
               <w:t>R²</w:t>
+            </w:r>
+          </w:p>
+        </w:tc>
+        <w:tc>
+          <w:tcPr>
+            <w:tcW w:type="dxa" w:w="1560"/>
+            <w:shd w:fill="eef2fb"/>
+            <w:tcMar>
+              <w:top w:w="120" w:type="dxa"/>
+              <w:bottom w:w="120" w:type="dxa"/>
+              <w:left w:w="120" w:type="dxa"/>
+              <w:right w:w="120" w:type="dxa"/>
+            </w:tcMar>
+          </w:tcPr>
+          <w:p>
+            <w:pPr>
+              <w:spacing w:after="0"/>
+              <w:jc w:val="center"/>
+            </w:pPr>
+            <w:r>
+              <w:rPr>
+                <w:rFonts w:ascii="Calibri" w:hAnsi="Calibri"/>
+                <w:b/>
+                <w:color w:val="1E3A8A"/>
+                <w:sz w:val="20"/>
+              </w:rPr>
+              <w:t>Mejora</w:t>
             </w:r>
           </w:p>
         </w:tc>
@@ -444,32 +1743,46 @@
       <w:tr>
         <w:tc>
           <w:tcPr>
-            <w:tcW w:type="dxa" w:w="1872"/>
-            <w:shd w:fill="F2F2F2"/>
+            <w:tcW w:type="dxa" w:w="1560"/>
+            <w:tcMar>
+              <w:top w:w="120" w:type="dxa"/>
+              <w:bottom w:w="120" w:type="dxa"/>
+              <w:left w:w="120" w:type="dxa"/>
+              <w:right w:w="120" w:type="dxa"/>
+            </w:tcMar>
           </w:tcPr>
           <w:p>
             <w:pPr>
+              <w:spacing w:after="0"/>
               <w:jc w:val="left"/>
             </w:pPr>
             <w:r>
               <w:rPr>
+                <w:rFonts w:ascii="Calibri" w:hAnsi="Calibri"/>
                 <w:sz w:val="19"/>
               </w:rPr>
-              <w:t>Regresión Lineal Simple (Rim)</w:t>
+              <w:t>Regresión Simple (Rim)</w:t>
             </w:r>
           </w:p>
         </w:tc>
         <w:tc>
           <w:tcPr>
-            <w:tcW w:type="dxa" w:w="1872"/>
-            <w:shd w:fill="F2F2F2"/>
+            <w:tcW w:type="dxa" w:w="1560"/>
+            <w:tcMar>
+              <w:top w:w="120" w:type="dxa"/>
+              <w:bottom w:w="120" w:type="dxa"/>
+              <w:left w:w="120" w:type="dxa"/>
+              <w:right w:w="120" w:type="dxa"/>
+            </w:tcMar>
           </w:tcPr>
           <w:p>
             <w:pPr>
+              <w:spacing w:after="0"/>
               <w:jc w:val="right"/>
             </w:pPr>
             <w:r>
               <w:rPr>
+                <w:rFonts w:ascii="Calibri" w:hAnsi="Calibri"/>
                 <w:sz w:val="19"/>
               </w:rPr>
               <w:t>2.795,00</w:t>
@@ -478,15 +1791,22 @@
         </w:tc>
         <w:tc>
           <w:tcPr>
-            <w:tcW w:type="dxa" w:w="1872"/>
-            <w:shd w:fill="F2F2F2"/>
+            <w:tcW w:type="dxa" w:w="1560"/>
+            <w:tcMar>
+              <w:top w:w="120" w:type="dxa"/>
+              <w:bottom w:w="120" w:type="dxa"/>
+              <w:left w:w="120" w:type="dxa"/>
+              <w:right w:w="120" w:type="dxa"/>
+            </w:tcMar>
           </w:tcPr>
           <w:p>
             <w:pPr>
+              <w:spacing w:after="0"/>
               <w:jc w:val="right"/>
             </w:pPr>
             <w:r>
               <w:rPr>
+                <w:rFonts w:ascii="Calibri" w:hAnsi="Calibri"/>
                 <w:sz w:val="19"/>
               </w:rPr>
               <w:t>14.651.537,71</w:t>
@@ -495,15 +1815,22 @@
         </w:tc>
         <w:tc>
           <w:tcPr>
-            <w:tcW w:type="dxa" w:w="1872"/>
-            <w:shd w:fill="F2F2F2"/>
+            <w:tcW w:type="dxa" w:w="1560"/>
+            <w:tcMar>
+              <w:top w:w="120" w:type="dxa"/>
+              <w:bottom w:w="120" w:type="dxa"/>
+              <w:left w:w="120" w:type="dxa"/>
+              <w:right w:w="120" w:type="dxa"/>
+            </w:tcMar>
           </w:tcPr>
           <w:p>
             <w:pPr>
+              <w:spacing w:after="0"/>
               <w:jc w:val="right"/>
             </w:pPr>
             <w:r>
               <w:rPr>
+                <w:rFonts w:ascii="Calibri" w:hAnsi="Calibri"/>
                 <w:sz w:val="19"/>
               </w:rPr>
               <w:t>3.827,73</w:t>
@@ -512,18 +1839,49 @@
         </w:tc>
         <w:tc>
           <w:tcPr>
-            <w:tcW w:type="dxa" w:w="1872"/>
-            <w:shd w:fill="F2F2F2"/>
+            <w:tcW w:type="dxa" w:w="1560"/>
+            <w:tcMar>
+              <w:top w:w="120" w:type="dxa"/>
+              <w:bottom w:w="120" w:type="dxa"/>
+              <w:left w:w="120" w:type="dxa"/>
+              <w:right w:w="120" w:type="dxa"/>
+            </w:tcMar>
           </w:tcPr>
           <w:p>
             <w:pPr>
+              <w:spacing w:after="0"/>
               <w:jc w:val="right"/>
             </w:pPr>
             <w:r>
               <w:rPr>
+                <w:rFonts w:ascii="Calibri" w:hAnsi="Calibri"/>
                 <w:sz w:val="19"/>
               </w:rPr>
               <w:t>0,5421</w:t>
+            </w:r>
+          </w:p>
+        </w:tc>
+        <w:tc>
+          <w:tcPr>
+            <w:tcW w:type="dxa" w:w="1560"/>
+            <w:tcMar>
+              <w:top w:w="120" w:type="dxa"/>
+              <w:bottom w:w="120" w:type="dxa"/>
+              <w:left w:w="120" w:type="dxa"/>
+              <w:right w:w="120" w:type="dxa"/>
+            </w:tcMar>
+          </w:tcPr>
+          <w:p>
+            <w:pPr>
+              <w:spacing w:after="0"/>
+              <w:jc w:val="left"/>
+            </w:pPr>
+            <w:r>
+              <w:rPr>
+                <w:rFonts w:ascii="Calibri" w:hAnsi="Calibri"/>
+                <w:sz w:val="19"/>
+              </w:rPr>
+              <w:t>Línea Base</w:t>
             </w:r>
           </w:p>
         </w:tc>
@@ -531,30 +1889,48 @@
       <w:tr>
         <w:tc>
           <w:tcPr>
-            <w:tcW w:type="dxa" w:w="1872"/>
+            <w:tcW w:type="dxa" w:w="1560"/>
+            <w:tcMar>
+              <w:top w:w="120" w:type="dxa"/>
+              <w:bottom w:w="120" w:type="dxa"/>
+              <w:left w:w="120" w:type="dxa"/>
+              <w:right w:w="120" w:type="dxa"/>
+            </w:tcMar>
           </w:tcPr>
           <w:p>
             <w:pPr>
+              <w:spacing w:after="0"/>
               <w:jc w:val="left"/>
             </w:pPr>
             <w:r>
               <w:rPr>
+                <w:rFonts w:ascii="Calibri" w:hAnsi="Calibri"/>
                 <w:sz w:val="19"/>
               </w:rPr>
-              <w:t>Regresión Lineal Múltiple (Specs + Brand)</w:t>
+              <w:t>Regresión Múltiple (Specs+Brand)</w:t>
             </w:r>
           </w:p>
         </w:tc>
         <w:tc>
           <w:tcPr>
-            <w:tcW w:type="dxa" w:w="1872"/>
+            <w:tcW w:type="dxa" w:w="1560"/>
+            <w:tcMar>
+              <w:top w:w="120" w:type="dxa"/>
+              <w:bottom w:w="120" w:type="dxa"/>
+              <w:left w:w="120" w:type="dxa"/>
+              <w:right w:w="120" w:type="dxa"/>
+            </w:tcMar>
           </w:tcPr>
           <w:p>
             <w:pPr>
+              <w:spacing w:after="0"/>
               <w:jc w:val="right"/>
             </w:pPr>
             <w:r>
               <w:rPr>
+                <w:rFonts w:ascii="Calibri" w:hAnsi="Calibri"/>
+                <w:b/>
+                <w:color w:val="15803D"/>
                 <w:sz w:val="19"/>
               </w:rPr>
               <w:t>1.678,60</w:t>
@@ -563,14 +1939,22 @@
         </w:tc>
         <w:tc>
           <w:tcPr>
-            <w:tcW w:type="dxa" w:w="1872"/>
+            <w:tcW w:type="dxa" w:w="1560"/>
+            <w:tcMar>
+              <w:top w:w="120" w:type="dxa"/>
+              <w:bottom w:w="120" w:type="dxa"/>
+              <w:left w:w="120" w:type="dxa"/>
+              <w:right w:w="120" w:type="dxa"/>
+            </w:tcMar>
           </w:tcPr>
           <w:p>
             <w:pPr>
+              <w:spacing w:after="0"/>
               <w:jc w:val="right"/>
             </w:pPr>
             <w:r>
               <w:rPr>
+                <w:rFonts w:ascii="Calibri" w:hAnsi="Calibri"/>
                 <w:sz w:val="19"/>
               </w:rPr>
               <w:t>6.499.975,49</w:t>
@@ -579,14 +1963,22 @@
         </w:tc>
         <w:tc>
           <w:tcPr>
-            <w:tcW w:type="dxa" w:w="1872"/>
+            <w:tcW w:type="dxa" w:w="1560"/>
+            <w:tcMar>
+              <w:top w:w="120" w:type="dxa"/>
+              <w:bottom w:w="120" w:type="dxa"/>
+              <w:left w:w="120" w:type="dxa"/>
+              <w:right w:w="120" w:type="dxa"/>
+            </w:tcMar>
           </w:tcPr>
           <w:p>
             <w:pPr>
+              <w:spacing w:after="0"/>
               <w:jc w:val="right"/>
             </w:pPr>
             <w:r>
               <w:rPr>
+                <w:rFonts w:ascii="Calibri" w:hAnsi="Calibri"/>
                 <w:sz w:val="19"/>
               </w:rPr>
               <w:t>2.549,50</w:t>
@@ -595,58 +1987,145 @@
         </w:tc>
         <w:tc>
           <w:tcPr>
-            <w:tcW w:type="dxa" w:w="1872"/>
+            <w:tcW w:type="dxa" w:w="1560"/>
+            <w:tcMar>
+              <w:top w:w="120" w:type="dxa"/>
+              <w:bottom w:w="120" w:type="dxa"/>
+              <w:left w:w="120" w:type="dxa"/>
+              <w:right w:w="120" w:type="dxa"/>
+            </w:tcMar>
           </w:tcPr>
           <w:p>
             <w:pPr>
+              <w:spacing w:after="0"/>
               <w:jc w:val="right"/>
             </w:pPr>
             <w:r>
               <w:rPr>
+                <w:rFonts w:ascii="Calibri" w:hAnsi="Calibri"/>
                 <w:b/>
-                <w:color w:val="006600"/>
+                <w:color w:val="15803D"/>
                 <w:sz w:val="19"/>
               </w:rPr>
               <w:t>0,7968</w:t>
             </w:r>
           </w:p>
         </w:tc>
+        <w:tc>
+          <w:tcPr>
+            <w:tcW w:type="dxa" w:w="1560"/>
+            <w:tcMar>
+              <w:top w:w="120" w:type="dxa"/>
+              <w:bottom w:w="120" w:type="dxa"/>
+              <w:left w:w="120" w:type="dxa"/>
+              <w:right w:w="120" w:type="dxa"/>
+            </w:tcMar>
+          </w:tcPr>
+          <w:p>
+            <w:pPr>
+              <w:spacing w:after="0"/>
+              <w:jc w:val="left"/>
+            </w:pPr>
+            <w:r>
+              <w:rPr>
+                <w:rFonts w:ascii="Calibri" w:hAnsi="Calibri"/>
+                <w:b/>
+                <w:color w:val="15803D"/>
+                <w:sz w:val="19"/>
+              </w:rPr>
+              <w:t>-39,94% MAE</w:t>
+              <w:br/>
+              <w:t>+46,98% R²</w:t>
+            </w:r>
+          </w:p>
+        </w:tc>
       </w:tr>
     </w:tbl>
-    <w:p/>
     <w:p>
       <w:pPr>
-        <w:spacing w:before="320" w:after="120"/>
+        <w:spacing w:after="160"/>
+      </w:pPr>
+    </w:p>
+    <w:tbl>
+      <w:tblPr>
+        <w:tblW w:type="auto" w:w="0"/>
+        <w:jc w:val="center"/>
+        <w:tblLook w:firstColumn="1" w:firstRow="1" w:lastColumn="0" w:lastRow="0" w:noHBand="0" w:noVBand="1" w:val="04A0"/>
+      </w:tblPr>
+      <w:tblGrid>
+        <w:gridCol w:w="9360"/>
+      </w:tblGrid>
+      <w:tr>
+        <w:tc>
+          <w:tcPr>
+            <w:tcW w:type="dxa" w:w="9360"/>
+            <w:shd w:fill="fff7ed"/>
+            <w:tcMar>
+              <w:top w:w="140" w:type="dxa"/>
+              <w:bottom w:w="140" w:type="dxa"/>
+              <w:left w:w="200" w:type="dxa"/>
+              <w:right w:w="200" w:type="dxa"/>
+            </w:tcMar>
+            <w:tcBorders>
+              <w:top w:val="none"/>
+              <w:bottom w:val="none"/>
+              <w:left w:val="single" w:sz="24" w:space="0" w:color="f97316"/>
+              <w:right w:val="none"/>
+            </w:tcBorders>
+          </w:tcPr>
+          <w:p>
+            <w:pPr>
+              <w:spacing w:before="0" w:after="0" w:line="276" w:lineRule="auto"/>
+            </w:pPr>
+            <w:r>
+              <w:rPr>
+                <w:rFonts w:ascii="Calibri" w:hAnsi="Calibri"/>
+                <w:b/>
+                <w:color w:val="9A3412"/>
+                <w:sz w:val="21"/>
+              </w:rPr>
+              <w:t>📌 Interpretación Pedagógica de Métricas (MAE frente a RMSE)</w:t>
+              <w:br/>
+            </w:r>
+            <w:r>
+              <w:rPr>
+                <w:rFonts w:ascii="Calibri" w:hAnsi="Calibri"/>
+                <w:color w:val="7C2D12"/>
+                <w:sz w:val="20"/>
+              </w:rPr>
+              <w:t>El Error Absoluto Medio (MAE) cuantifica la magnitud media del error sin ponderación diferencial: en promedio, las predicciones del modelo múltiple se desvían en $1.678,60 INR del valor real. Por su parte, la Raíz del Error Cuadrático Medio (RMSE) eleva las diferencias al cuadrado antes de promediar, penalizando de manera cuadrática los desvíos severos. La diferencia entre RMSE ($2.549,50) y MAE ($1.678,60) evidencia que, aunque el modelo predice con alta precisión el cuerpo central del catálogo, coexiste un número reducido de productos atípicos en la gama premium con errores mayores.</w:t>
+            </w:r>
+          </w:p>
+        </w:tc>
+      </w:tr>
+    </w:tbl>
+    <w:p>
+      <w:pPr>
+        <w:spacing w:after="80"/>
+      </w:pPr>
+    </w:p>
+    <w:p>
+      <w:pPr>
+        <w:spacing w:before="0" w:after="120" w:line="276" w:lineRule="auto"/>
       </w:pPr>
       <w:r>
         <w:rPr>
-          <w:b/>
-          <w:color w:val="1F4E79"/>
-          <w:sz w:val="28"/>
+          <w:rFonts w:ascii="Calibri" w:hAnsi="Calibri"/>
+          <w:color w:val="1A1A2E"/>
+          <w:sz w:val="21"/>
         </w:rPr>
-        <w:t>8. Diagnóstico de Generalización y Gráficos</w:t>
+        <w:t>• Diagnóstico de Generalización (Capacidad Predictiva Train vs. Test):</w:t>
+        <w:br/>
+        <w:t xml:space="preserve">  - Train: R² = 0,8966  |  RMSE = 1.832,23 INR</w:t>
+        <w:br/>
+        <w:t xml:space="preserve">  - Test:  R² = 0,7968  |  RMSE = 2.549,50 INR</w:t>
+        <w:br/>
+        <w:t>La estrecha correspondencia de desempeño entre el conjunto de entrenamiento y el de prueba descarta la presencia de sobreajuste severo (overfitting) y confirma la robustez del modelo para generalizar ante nuevas especificaciones técnicas de productos.</w:t>
       </w:r>
     </w:p>
     <w:p>
       <w:pPr>
-        <w:spacing w:after="120" w:line="276" w:lineRule="auto"/>
-      </w:pPr>
-      <w:r>
-        <w:rPr>
-          <w:sz w:val="22"/>
-        </w:rPr>
-        <w:t>• Comparación Train vs. Test:</w:t>
-        <w:br/>
-        <w:t xml:space="preserve">  - Train: R² = 0,8966 | RMSE = 1.832,23 INR</w:t>
-        <w:br/>
-        <w:t xml:space="preserve">  - Test:  R² = 0,7968 | RMSE = 2.549,50 INR</w:t>
-        <w:br/>
-        <w:t>Diagnóstico: La proximidad de métricas entre Train y Test descarta la presencia de sobreajuste severo (overfitting) y corrobora una capacidad de generalización sólida sobre muestras independientes.</w:t>
-      </w:r>
-    </w:p>
-    <w:p/>
-    <w:p>
-      <w:pPr>
+        <w:spacing w:before="200" w:after="40"/>
         <w:jc w:val="center"/>
       </w:pPr>
     </w:p>
@@ -688,89 +2167,388 @@
     </w:p>
     <w:p>
       <w:pPr>
+        <w:spacing w:after="280"/>
         <w:jc w:val="center"/>
       </w:pPr>
       <w:r>
         <w:rPr>
+          <w:rFonts w:ascii="Calibri" w:hAnsi="Calibri"/>
           <w:i/>
+          <w:color w:val="5B6472"/>
           <w:sz w:val="19"/>
         </w:rPr>
-        <w:t>Figura 1: Diagnóstico Visual del Modelado (Recta Simple, Real vs. Predicho y Residuos).</w:t>
-      </w:r>
-    </w:p>
-    <w:p/>
-    <w:p>
-      <w:pPr>
-        <w:spacing w:before="320" w:after="120"/>
-      </w:pPr>
-      <w:r>
-        <w:rPr>
-          <w:b/>
-          <w:color w:val="1F4E79"/>
-          <w:sz w:val="28"/>
-        </w:rPr>
-        <w:t>9. Conclusiones y Respuestas a las Preguntas Guía</w:t>
+        <w:t>Figura 1: Diagnóstico Visual del Modelo — Recta Simple, Valores Reales vs. Predichos y Dispersión de Residuos.</w:t>
       </w:r>
     </w:p>
     <w:p>
       <w:pPr>
-        <w:spacing w:after="120" w:line="276" w:lineRule="auto"/>
+        <w:spacing w:before="360" w:after="20"/>
       </w:pPr>
       <w:r>
         <w:rPr>
+          <w:rFonts w:ascii="Calibri" w:hAnsi="Calibri"/>
+          <w:b/>
+          <w:color w:val="2563EB"/>
           <w:sz w:val="22"/>
         </w:rPr>
-        <w:t>1. ¿Qué variable predecimos? El costo unitario (Unit Cost en INR) de cada neumático.</w:t>
-        <w:br/>
-        <w:t>2. ¿Qué variables ayudan a explicarla? El diámetro del rin (Rim), el ancho (Width), la relación de aspecto (Aspect Ratio) y la marca (Brand).</w:t>
-        <w:br/>
-        <w:t>3. ¿Qué tan bien funciona el baseline? Explica por sí solo el 54,21% de la varianza, pero deja un error promedio alto (2.795 INR).</w:t>
-        <w:br/>
-        <w:t>4. ¿Qué ocurre al incorporar Width, Ratio y Brand? El R² se eleva a casi el 80% (0,7968) y el error MAE se reduce en un 40%.</w:t>
-        <w:br/>
-        <w:t>5. ¿Cómo cambia el MAE? Disminuye drásticamente de 2.795,00 INR a 1.678,60 INR.</w:t>
-        <w:br/>
-        <w:t>6. ¿Cómo cambia el RMSE? Desciende de 3.827,73 INR a 2.549,50 INR, mitigando errores grandes.</w:t>
-        <w:br/>
-        <w:t>7. ¿Cómo cambia el R²? Se incrementa en casi 25 puntos porcentuales netos (de 0,5421 a 0,7968).</w:t>
-        <w:br/>
-        <w:t>8. ¿Existen indicios de errores sistemáticos? No en la masa general de productos; se aprecia mayor dispersión residual únicamente en los neumáticos de alta gama (más de 25.000 INR).</w:t>
-        <w:br/>
-        <w:t>9. ¿El modelo generaliza razonablemente a Test? Sí, los resultados en prueba replican coherentemente el nivel de acierto de entrenamiento.</w:t>
-        <w:br/>
-        <w:t>10. ¿Qué limitaciones quedan para la siguiente entrega? La linealidad estricta no modela interacciones no lineales ni asimetrías de cola.</w:t>
+        <w:t>FASE 5</w:t>
       </w:r>
     </w:p>
     <w:p>
       <w:pPr>
-        <w:spacing w:before="320" w:after="120"/>
+        <w:spacing w:before="0" w:after="160"/>
       </w:pPr>
       <w:r>
         <w:rPr>
+          <w:rFonts w:ascii="Calibri" w:hAnsi="Calibri"/>
           <w:b/>
-          <w:color w:val="1F4E79"/>
-          <w:sz w:val="28"/>
+          <w:color w:val="1E3A8A"/>
+          <w:sz w:val="30"/>
         </w:rPr>
-        <w:t>10. Roadmap hacia la Evidencia N.º 3 (Trabajo Futuro)</w:t>
+        <w:t>Respuestas a las Preguntas Guía de la Cátedra</w:t>
       </w:r>
     </w:p>
     <w:p>
       <w:pPr>
-        <w:spacing w:after="120" w:line="276" w:lineRule="auto"/>
+        <w:spacing w:before="0" w:after="120" w:line="276" w:lineRule="auto"/>
       </w:pPr>
       <w:r>
         <w:rPr>
+          <w:rFonts w:ascii="Calibri" w:hAnsi="Calibri"/>
+          <w:color w:val="1A1A2E"/>
+          <w:sz w:val="21"/>
+        </w:rPr>
+        <w:t>Para estructurar la defensa académica de la evidencia, se sintetizan las respuestas a los interrogantes planteados en las orientaciones docentes:</w:t>
+      </w:r>
+    </w:p>
+    <w:p>
+      <w:pPr>
+        <w:spacing w:before="80" w:after="20"/>
+      </w:pPr>
+      <w:r>
+        <w:rPr>
+          <w:rFonts w:ascii="Calibri" w:hAnsi="Calibri"/>
+          <w:b/>
+          <w:color w:val="1E3A8A"/>
+          <w:sz w:val="21"/>
+        </w:rPr>
+        <w:t>1. ¿Qué variable queremos predecir y cuál es su naturaleza?</w:t>
+      </w:r>
+    </w:p>
+    <w:p>
+      <w:pPr>
+        <w:spacing w:before="0" w:after="80"/>
+        <w:ind w:left="288"/>
+      </w:pPr>
+      <w:r>
+        <w:rPr>
+          <w:rFonts w:ascii="Calibri" w:hAnsi="Calibri"/>
+          <w:color w:val="1A1A2E"/>
+          <w:sz w:val="20"/>
+        </w:rPr>
+        <w:t>El costo unitario (Unit Cost (INR)). Es una variable cuantitativa continua en escala de razón, correspondiente al costo individual de manufactura de cada SKU en inventario.</w:t>
+      </w:r>
+    </w:p>
+    <w:p>
+      <w:pPr>
+        <w:spacing w:before="80" w:after="20"/>
+      </w:pPr>
+      <w:r>
+        <w:rPr>
+          <w:rFonts w:ascii="Calibri" w:hAnsi="Calibri"/>
+          <w:b/>
+          <w:color w:val="1E3A8A"/>
+          <w:sz w:val="21"/>
+        </w:rPr>
+        <w:t>2. ¿Qué variables ayudan a explicarla y cuál es la jerarquía observada en el EDA?</w:t>
+      </w:r>
+    </w:p>
+    <w:p>
+      <w:pPr>
+        <w:spacing w:before="0" w:after="80"/>
+        <w:ind w:left="288"/>
+      </w:pPr>
+      <w:r>
+        <w:rPr>
+          <w:rFonts w:ascii="Calibri" w:hAnsi="Calibri"/>
+          <w:color w:val="1A1A2E"/>
+          <w:sz w:val="20"/>
+        </w:rPr>
+        <w:t>Las cotas físicas extraídas de Product Name (Rim, Width y Aspect Ratio) y el fabricante (Brand). El rin es el predictor individual con mayor correlación (r = 0,76), seguido del ancho (r = 0,44).</w:t>
+      </w:r>
+    </w:p>
+    <w:p>
+      <w:pPr>
+        <w:spacing w:before="80" w:after="20"/>
+      </w:pPr>
+      <w:r>
+        <w:rPr>
+          <w:rFonts w:ascii="Calibri" w:hAnsi="Calibri"/>
+          <w:b/>
+          <w:color w:val="1E3A8A"/>
+          <w:sz w:val="21"/>
+        </w:rPr>
+        <w:t>3. ¿Qué tan bien funciona el modelo simple con una sola variable predictora?</w:t>
+      </w:r>
+    </w:p>
+    <w:p>
+      <w:pPr>
+        <w:spacing w:before="0" w:after="80"/>
+        <w:ind w:left="288"/>
+      </w:pPr>
+      <w:r>
+        <w:rPr>
+          <w:rFonts w:ascii="Calibri" w:hAnsi="Calibri"/>
+          <w:color w:val="1A1A2E"/>
+          <w:sz w:val="20"/>
+        </w:rPr>
+        <w:t>Alcanza un R² = 0,5421 en Test, explicando el 54% de la variabilidad del costo únicamente a partir del diámetro del rin. Sin embargo, su error medio es elevado (MAE = $2.795,00 INR), confirmando que una sola cota es insuficiente.</w:t>
+      </w:r>
+    </w:p>
+    <w:p>
+      <w:pPr>
+        <w:spacing w:before="80" w:after="20"/>
+      </w:pPr>
+      <w:r>
+        <w:rPr>
+          <w:rFonts w:ascii="Calibri" w:hAnsi="Calibri"/>
+          <w:b/>
+          <w:color w:val="1E3A8A"/>
+          <w:sz w:val="21"/>
+        </w:rPr>
+        <w:t>4. ¿Qué ocurre al incorporar Width, Aspect Ratio y Brand?</w:t>
+      </w:r>
+    </w:p>
+    <w:p>
+      <w:pPr>
+        <w:spacing w:before="0" w:after="80"/>
+        <w:ind w:left="288"/>
+      </w:pPr>
+      <w:r>
+        <w:rPr>
+          <w:rFonts w:ascii="Calibri" w:hAnsi="Calibri"/>
+          <w:color w:val="1A1A2E"/>
+          <w:sz w:val="20"/>
+        </w:rPr>
+        <w:t>El coeficiente de determinación salta a R² = 0,7968 (explicando casi el 80% de la varianza del costo en prueba) y el error MAE se reduce a $1.678,60 INR (mejora de casi el 40%).</w:t>
+      </w:r>
+    </w:p>
+    <w:p>
+      <w:pPr>
+        <w:spacing w:before="80" w:after="20"/>
+      </w:pPr>
+      <w:r>
+        <w:rPr>
+          <w:rFonts w:ascii="Calibri" w:hAnsi="Calibri"/>
+          <w:b/>
+          <w:color w:val="1E3A8A"/>
+          <w:sz w:val="21"/>
+        </w:rPr>
+        <w:t>5. ¿Cómo cambia el MAE entre el modelo simple y el múltiple?</w:t>
+      </w:r>
+    </w:p>
+    <w:p>
+      <w:pPr>
+        <w:spacing w:before="0" w:after="80"/>
+        <w:ind w:left="288"/>
+      </w:pPr>
+      <w:r>
+        <w:rPr>
+          <w:rFonts w:ascii="Calibri" w:hAnsi="Calibri"/>
+          <w:color w:val="1A1A2E"/>
+          <w:sz w:val="20"/>
+        </w:rPr>
+        <w:t>Se reduce en un 39,94%, cayendo de $2.795,00 INR a $1.678,60 INR, lo que representa una ganancia significativa en precisión media de cotización.</w:t>
+      </w:r>
+    </w:p>
+    <w:p>
+      <w:pPr>
+        <w:spacing w:before="80" w:after="20"/>
+      </w:pPr>
+      <w:r>
+        <w:rPr>
+          <w:rFonts w:ascii="Calibri" w:hAnsi="Calibri"/>
+          <w:b/>
+          <w:color w:val="1E3A8A"/>
+          <w:sz w:val="21"/>
+        </w:rPr>
+        <w:t>6. ¿Cómo cambia el RMSE y qué indica respecto a errores extremos?</w:t>
+      </w:r>
+    </w:p>
+    <w:p>
+      <w:pPr>
+        <w:spacing w:before="0" w:after="80"/>
+        <w:ind w:left="288"/>
+      </w:pPr>
+      <w:r>
+        <w:rPr>
+          <w:rFonts w:ascii="Calibri" w:hAnsi="Calibri"/>
+          <w:color w:val="1A1A2E"/>
+          <w:sz w:val="20"/>
+        </w:rPr>
+        <w:t>Disminuye un 33,39%, pasando de $3.827,73 INR a $2.549,50 INR. Al ser una métrica sensible a errores cuadráticos, su descenso confirma una reducción tangible de desviaciones extremas.</w:t>
+      </w:r>
+    </w:p>
+    <w:p>
+      <w:pPr>
+        <w:spacing w:before="80" w:after="20"/>
+      </w:pPr>
+      <w:r>
+        <w:rPr>
+          <w:rFonts w:ascii="Calibri" w:hAnsi="Calibri"/>
+          <w:b/>
+          <w:color w:val="1E3A8A"/>
+          <w:sz w:val="21"/>
+        </w:rPr>
+        <w:t>7. ¿Cómo cambia el R² y cómo se interpreta en términos de variabilidad explicada?</w:t>
+      </w:r>
+    </w:p>
+    <w:p>
+      <w:pPr>
+        <w:spacing w:before="0" w:after="80"/>
+        <w:ind w:left="288"/>
+      </w:pPr>
+      <w:r>
+        <w:rPr>
+          <w:rFonts w:ascii="Calibri" w:hAnsi="Calibri"/>
+          <w:color w:val="1A1A2E"/>
+          <w:sz w:val="20"/>
+        </w:rPr>
+        <w:t>Aumenta en 25,47 puntos porcentuales absolutos (de 54,21% a 79,68%), lo que representa un incremento relativo del +46,98% en capacidad explicativa.</w:t>
+      </w:r>
+    </w:p>
+    <w:p>
+      <w:pPr>
+        <w:spacing w:before="80" w:after="20"/>
+      </w:pPr>
+      <w:r>
+        <w:rPr>
+          <w:rFonts w:ascii="Calibri" w:hAnsi="Calibri"/>
+          <w:b/>
+          <w:color w:val="1E3A8A"/>
+          <w:sz w:val="21"/>
+        </w:rPr>
+        <w:t>8. ¿Existen indicios de errores sistemáticos en los residuos?</w:t>
+      </w:r>
+    </w:p>
+    <w:p>
+      <w:pPr>
+        <w:spacing w:before="0" w:after="80"/>
+        <w:ind w:left="288"/>
+      </w:pPr>
+      <w:r>
+        <w:rPr>
+          <w:rFonts w:ascii="Calibri" w:hAnsi="Calibri"/>
+          <w:color w:val="1A1A2E"/>
+          <w:sz w:val="20"/>
+        </w:rPr>
+        <w:t>Para el 90% del catálogo (cubiertas de hasta 15.000 INR) los residuos se distribuyen de forma homocedástica y simétrica en torno a cero. En neumáticos de ultra-alta gama (más de 25.000 INR), la dispersión residual crece, evidenciando heterocedasticidad en la cola derecha.</w:t>
+      </w:r>
+    </w:p>
+    <w:p>
+      <w:pPr>
+        <w:spacing w:before="80" w:after="20"/>
+      </w:pPr>
+      <w:r>
+        <w:rPr>
+          <w:rFonts w:ascii="Calibri" w:hAnsi="Calibri"/>
+          <w:b/>
+          <w:color w:val="1E3A8A"/>
+          <w:sz w:val="21"/>
+        </w:rPr>
+        <w:t>9. ¿El modelo generaliza razonablemente a datos no vistos (Test)?</w:t>
+      </w:r>
+    </w:p>
+    <w:p>
+      <w:pPr>
+        <w:spacing w:before="0" w:after="80"/>
+        <w:ind w:left="288"/>
+      </w:pPr>
+      <w:r>
+        <w:rPr>
+          <w:rFonts w:ascii="Calibri" w:hAnsi="Calibri"/>
+          <w:color w:val="1A1A2E"/>
+          <w:sz w:val="20"/>
+        </w:rPr>
+        <w:t>Sí. El R² desciende de 0,8966 en Train a 0,7968 en Test, lo cual es un comportamiento esperado y saludable que descarta sobreajuste severo.</w:t>
+      </w:r>
+    </w:p>
+    <w:p>
+      <w:pPr>
+        <w:spacing w:before="80" w:after="20"/>
+      </w:pPr>
+      <w:r>
+        <w:rPr>
+          <w:rFonts w:ascii="Calibri" w:hAnsi="Calibri"/>
+          <w:b/>
+          <w:color w:val="1E3A8A"/>
+          <w:sz w:val="21"/>
+        </w:rPr>
+        <w:t>10. ¿Qué limitaciones presenta el modelo actual y qué queda para la siguiente entrega?</w:t>
+      </w:r>
+    </w:p>
+    <w:p>
+      <w:pPr>
+        <w:spacing w:before="0" w:after="80"/>
+        <w:ind w:left="288"/>
+      </w:pPr>
+      <w:r>
+        <w:rPr>
+          <w:rFonts w:ascii="Calibri" w:hAnsi="Calibri"/>
+          <w:color w:val="1A1A2E"/>
+          <w:sz w:val="20"/>
+        </w:rPr>
+        <w:t>La formulación lineal no captura curvaturas en los extremos de precio ni la asimetría log-normal del target. Estas restricciones se abordarán en la Evidencia 3 mediante regularización y modelos de ensamble.</w:t>
+      </w:r>
+    </w:p>
+    <w:p>
+      <w:pPr>
+        <w:spacing w:before="360" w:after="20"/>
+      </w:pPr>
+      <w:r>
+        <w:rPr>
+          <w:rFonts w:ascii="Calibri" w:hAnsi="Calibri"/>
+          <w:b/>
+          <w:color w:val="2563EB"/>
           <w:sz w:val="22"/>
         </w:rPr>
-        <w:t>En concordancia con los lineamientos docentes, las etapas de optimización y ajuste fino quedan reservadas para la Tercera Evidencia:</w:t>
+        <w:t>FASE 6</w:t>
+      </w:r>
+    </w:p>
+    <w:p>
+      <w:pPr>
+        <w:spacing w:before="0" w:after="160"/>
+      </w:pPr>
+      <w:r>
+        <w:rPr>
+          <w:rFonts w:ascii="Calibri" w:hAnsi="Calibri"/>
+          <w:b/>
+          <w:color w:val="1E3A8A"/>
+          <w:sz w:val="30"/>
+        </w:rPr>
+        <w:t>Roadmap hacia la Evidencia N.º 3 (Trabajo Futuro)</w:t>
+      </w:r>
+    </w:p>
+    <w:p>
+      <w:pPr>
+        <w:spacing w:before="0" w:after="120" w:line="276" w:lineRule="auto"/>
+      </w:pPr>
+      <w:r>
+        <w:rPr>
+          <w:rFonts w:ascii="Calibri" w:hAnsi="Calibri"/>
+          <w:color w:val="1A1A2E"/>
+          <w:sz w:val="21"/>
+        </w:rPr>
+        <w:t>En estricta conformidad con las pautas de la cátedra, las técnicas de optimización avanzada quedan reservadas para la Tercera Evidencia:</w:t>
         <w:br/>
-        <w:t>• Transformación Logarítmica: Evaluación de ln(Unit Cost) para corregir la heterocedasticidad en productos de precio elevado.</w:t>
         <w:br/>
-        <w:t>• Regularización Lineal: Modelos Ridge (L2) y Lasso (L1) para controlar la colinealidad geométrica entre ancho y rin.</w:t>
+        <w:t>1. Transformación Logarítmica del Target: Aplicación de ln(Unit Cost) para corregir el sesgo positivo y estabilizar la varianza residual en la cola superior de precios.</w:t>
         <w:br/>
-        <w:t>• Modelos de Ensamble: Implementación de Random Forest Regressor y Gradient Boosting para capturar interacciones no lineales complejas.</w:t>
+        <w:t>2. Regularización Lineal: Implementación de regresión Ridge (penalización L2) y Lasso (penalización L1) para controlar la multicolinealidad geométrica entre ancho y diámetro de rin.</w:t>
         <w:br/>
-        <w:t>• Búsqueda Sistemática de Hiperparámetros: Optimización mediante GridSearchCV.</w:t>
+        <w:t>3. Modelos de Ensamble y No Lineales: Exploración de árboles de decisión, Random Forest Regressor y Gradient Boosting para capturar interacciones no lineales entre dimensiones.</w:t>
+        <w:br/>
+        <w:t>4. Optimización de Hiperparámetros: Ajuste sistemático de parámetros mediante validación cruzada k-fold (GridSearchCV).</w:t>
       </w:r>
     </w:p>
     <w:sectPr>

</xml_diff>